<commit_message>
Rename clock mode label to "по време"; note notifications in docs
Replace the user-facing "по часовник" label with "по време" in the
frontend, the pump-capacity error message, and documentation.docx
(internal identifiers such as regime=clock are unchanged). Documentation
now also states that user notifications will be designed at the real-site
deployment, alongside HTTPS/TLS and backup.

Co-Authored-By: Claude Sonnet 5 <noreply@anthropic.com>
</commit_message>
<xml_diff>
--- a/documentation/documentation.docx
+++ b/documentation/documentation.docx
@@ -117,7 +117,7 @@
         <w:spacing w:after="140" w:line="300" w:lineRule="auto"/>
       </w:pPr>
       <w:r>
-        <w:t>Земеделската площ се разделя логически на зони, всяка от които групира един или няколко сензора и помпа с нейните клапани. За всяка зона може да се избере независим режим на управление — ръчен, по часовник или по прагови стойности от сензорите — а системата следи автоматично за грешки и несъответствия и известява потребителите с права над съответната зона.</w:t>
+        <w:t>Земеделската площ се разделя логически на зони, всяка от които групира един или няколко сензора и помпа с нейните клапани. За всяка зона може да се избере независим режим на управление — ръчен, по време или по прагови стойности от сензорите — а системата следи автоматично за грешки и несъответствия и известява потребителите с права над съответната зона.</w:t>
       </w:r>
     </w:p>
     <w:p>
@@ -358,6 +358,22 @@
     </w:p>
     <w:p>
       <w:pPr>
+        <w:pStyle w:val="ListParagraph"/>
+        <w:numPr>
+          <w:ilvl w:val="0"/>
+          <w:numId w:val="3"/>
+        </w:numPr>
+        <w:spacing w:after="90" w:line="290" w:lineRule="auto"/>
+      </w:pPr>
+      <w:r>
+        <w:rPr>
+          <w:lang w:val="en-US"/>
+        </w:rPr>
+        <w:t>I2C multiplexer</w:t>
+      </w:r>
+    </w:p>
+    <w:p>
+      <w:pPr>
         <w:pStyle w:val="Heading2"/>
         <w:numPr>
           <w:ilvl w:val="1"/>
@@ -694,6 +710,7 @@
           <w:sz w:val="25"/>
           <w:szCs w:val="25"/>
         </w:rPr>
+        <w:lastRenderedPageBreak/>
         <w:t>Изпълнителен модул</w:t>
       </w:r>
     </w:p>
@@ -711,7 +728,6 @@
           <w:b/>
           <w:bCs/>
         </w:rPr>
-        <w:lastRenderedPageBreak/>
         <w:t xml:space="preserve">Приемане на команди: </w:t>
       </w:r>
       <w:r>
@@ -1107,7 +1123,677 @@
         <w:spacing w:after="90" w:line="290" w:lineRule="auto"/>
       </w:pPr>
       <w:r>
+        <w:lastRenderedPageBreak/>
         <w:t>След 3 неуспешни опита → съобщението се маркира като failed и се логва в zone_errors (health_checker.py го засича).</w:t>
+      </w:r>
+    </w:p>
+    <w:p>
+      <w:pPr>
+        <w:pStyle w:val="Heading2"/>
+        <w:numPr>
+          <w:ilvl w:val="1"/>
+          <w:numId w:val="2"/>
+        </w:numPr>
+        <w:spacing w:before="320" w:after="140"/>
+      </w:pPr>
+      <w:r>
+        <w:rPr>
+          <w:b/>
+          <w:bCs/>
+          <w:color w:val="000000"/>
+          <w:sz w:val="25"/>
+          <w:szCs w:val="25"/>
+        </w:rPr>
+        <w:t>Repeater</w:t>
+      </w:r>
+    </w:p>
+    <w:p>
+      <w:pPr>
+        <w:pStyle w:val="ListParagraph"/>
+        <w:numPr>
+          <w:ilvl w:val="0"/>
+          <w:numId w:val="3"/>
+        </w:numPr>
+        <w:spacing w:after="90" w:line="290" w:lineRule="auto"/>
+      </w:pPr>
+      <w:r>
+        <w:t>Чете всяко съобщение на втората работна честота (тая, на която предават sensor-ите избрали „през Repeater“) и го препраща на основната честота, на която слуша Gateway-ят.</w:t>
+      </w:r>
+    </w:p>
+    <w:p>
+      <w:pPr>
+        <w:pStyle w:val="ListParagraph"/>
+        <w:numPr>
+          <w:ilvl w:val="0"/>
+          <w:numId w:val="3"/>
+        </w:numPr>
+        <w:spacing w:after="90" w:line="290" w:lineRule="auto"/>
+      </w:pPr>
+      <w:r>
+        <w:rPr>
+          <w:b/>
+          <w:bCs/>
+        </w:rPr>
+        <w:t xml:space="preserve">Дедупликация: </w:t>
+      </w:r>
+      <w:r>
+        <w:t>за да не се получи дублирано препращане (напр. два Repeater-а чуват един и същ sensor пакет) — всеки Repeater пази кратка памет за наскоро препратени пакети и отказва да препрати нещо, което вече е препратил, или нещо, което вече носи белег, че е препратено от друг Repeater (собствен маркер байт в края на пакета).</w:t>
+      </w:r>
+    </w:p>
+    <w:p>
+      <w:pPr>
+        <w:pStyle w:val="ListParagraph"/>
+        <w:numPr>
+          <w:ilvl w:val="0"/>
+          <w:numId w:val="3"/>
+        </w:numPr>
+        <w:spacing w:after="90" w:line="290" w:lineRule="auto"/>
+      </w:pPr>
+      <w:r>
+        <w:rPr>
+          <w:b/>
+          <w:bCs/>
+        </w:rPr>
+        <w:t xml:space="preserve">CAD: </w:t>
+      </w:r>
+      <w:r>
+        <w:t>непосредствено преди да предаде каквото и да е (препратен пакет или собствен heartbeat), проверява дали радио каналът е свободен (Channel Activity Detection) — ако е зает, изчаква и опитва отново малко по-късно.</w:t>
+      </w:r>
+    </w:p>
+    <w:p>
+      <w:pPr>
+        <w:pStyle w:val="ListParagraph"/>
+        <w:numPr>
+          <w:ilvl w:val="0"/>
+          <w:numId w:val="3"/>
+        </w:numPr>
+        <w:spacing w:after="90" w:line="290" w:lineRule="auto"/>
+      </w:pPr>
+      <w:r>
+        <w:t>Изпраща и собствен heartbeat периодично.</w:t>
+      </w:r>
+    </w:p>
+    <w:p>
+      <w:pPr>
+        <w:pStyle w:val="Heading2"/>
+        <w:numPr>
+          <w:ilvl w:val="1"/>
+          <w:numId w:val="2"/>
+        </w:numPr>
+        <w:spacing w:before="320" w:after="140"/>
+      </w:pPr>
+      <w:r>
+        <w:rPr>
+          <w:b/>
+          <w:bCs/>
+          <w:color w:val="000000"/>
+          <w:sz w:val="25"/>
+          <w:szCs w:val="25"/>
+        </w:rPr>
+        <w:t>LoRa Gateway (TTGO)</w:t>
+      </w:r>
+    </w:p>
+    <w:p>
+      <w:pPr>
+        <w:pStyle w:val="ListParagraph"/>
+        <w:numPr>
+          <w:ilvl w:val="0"/>
+          <w:numId w:val="3"/>
+        </w:numPr>
+        <w:spacing w:after="90" w:line="290" w:lineRule="auto"/>
+      </w:pPr>
+      <w:r>
+        <w:t>Някакъв watchdog като цяло — софтуерен или хардуерен.</w:t>
+      </w:r>
+    </w:p>
+    <w:p>
+      <w:pPr>
+        <w:pStyle w:val="ListParagraph"/>
+        <w:numPr>
+          <w:ilvl w:val="0"/>
+          <w:numId w:val="3"/>
+        </w:numPr>
+        <w:spacing w:after="90" w:line="290" w:lineRule="auto"/>
+      </w:pPr>
+      <w:r>
+        <w:t>Чете LoRa съобщение — ако е информация от сензори, я препраща към MQTT broker; в същото време очаква команда за препращане.</w:t>
+      </w:r>
+    </w:p>
+    <w:p>
+      <w:pPr>
+        <w:pStyle w:val="ListParagraph"/>
+        <w:numPr>
+          <w:ilvl w:val="0"/>
+          <w:numId w:val="3"/>
+        </w:numPr>
+        <w:spacing w:after="90" w:line="290" w:lineRule="auto"/>
+      </w:pPr>
+      <w:r>
+        <w:rPr>
+          <w:b/>
+          <w:bCs/>
+        </w:rPr>
+        <w:t xml:space="preserve">Буфериране: </w:t>
+      </w:r>
+      <w:r>
+        <w:t>ако мрежата спре, запазва в буфер последните данни от сензорите (напр. ако сървърът е на друго място).</w:t>
+      </w:r>
+    </w:p>
+    <w:p>
+      <w:pPr>
+        <w:pStyle w:val="ListParagraph"/>
+        <w:numPr>
+          <w:ilvl w:val="0"/>
+          <w:numId w:val="3"/>
+        </w:numPr>
+        <w:spacing w:after="90" w:line="290" w:lineRule="auto"/>
+      </w:pPr>
+      <w:r>
+        <w:rPr>
+          <w:b/>
+          <w:bCs/>
+        </w:rPr>
+        <w:t xml:space="preserve">Software watchdog за WiFi/MQTT: </w:t>
+      </w:r>
+      <w:r>
+        <w:t>ако MQTT връзката отпадне за &gt;N секунди — форсиран ESP.restart().</w:t>
+      </w:r>
+    </w:p>
+    <w:p>
+      <w:pPr>
+        <w:pStyle w:val="ListParagraph"/>
+        <w:numPr>
+          <w:ilvl w:val="0"/>
+          <w:numId w:val="3"/>
+        </w:numPr>
+        <w:spacing w:after="90" w:line="290" w:lineRule="auto"/>
+      </w:pPr>
+      <w:r>
+        <w:t>При команда — изпраща в топика за обратна връзка резултата от изпълнението ѝ.</w:t>
+      </w:r>
+    </w:p>
+    <w:p>
+      <w:pPr>
+        <w:pStyle w:val="Heading2"/>
+        <w:numPr>
+          <w:ilvl w:val="1"/>
+          <w:numId w:val="2"/>
+        </w:numPr>
+        <w:spacing w:before="320" w:after="140"/>
+      </w:pPr>
+      <w:r>
+        <w:rPr>
+          <w:b/>
+          <w:bCs/>
+          <w:color w:val="000000"/>
+          <w:sz w:val="25"/>
+          <w:szCs w:val="25"/>
+        </w:rPr>
+        <w:t>Server — Raspberry Pi</w:t>
+      </w:r>
+    </w:p>
+    <w:p>
+      <w:pPr>
+        <w:pStyle w:val="ListParagraph"/>
+        <w:numPr>
+          <w:ilvl w:val="0"/>
+          <w:numId w:val="3"/>
+        </w:numPr>
+        <w:spacing w:after="90" w:line="290" w:lineRule="auto"/>
+      </w:pPr>
+      <w:r>
+        <w:t>Raspberry Pi 4/5 — SSH remote достъп, watchdog на самото Pi (софтуерен или хардуерен).</w:t>
+      </w:r>
+    </w:p>
+    <w:p>
+      <w:pPr>
+        <w:pStyle w:val="ListParagraph"/>
+        <w:numPr>
+          <w:ilvl w:val="0"/>
+          <w:numId w:val="3"/>
+        </w:numPr>
+        <w:spacing w:after="90" w:line="290" w:lineRule="auto"/>
+      </w:pPr>
+      <w:r>
+        <w:rPr>
+          <w:b/>
+          <w:bCs/>
+        </w:rPr>
+        <w:t xml:space="preserve">Деплоймънт през SSH: </w:t>
+      </w:r>
+      <w:r>
+        <w:t>копирането на deploy/ папката (docker-compose.yml, .env, mosquitto.conf, mosquitto_passwd) става с rsync през SSH сесия; инсталацията/ъпдейтът (docker compose up -d, docker compose pull &amp;&amp; docker compose up -d) се изпълняват директно на Pi-то през активна SSH връзка. SSH каналът е вече криптиран end-to-end, затова не е нужен допълнителен HTTPS слой специално за самия deployment процес.</w:t>
+      </w:r>
+    </w:p>
+    <w:p>
+      <w:pPr>
+        <w:pStyle w:val="ListParagraph"/>
+        <w:numPr>
+          <w:ilvl w:val="0"/>
+          <w:numId w:val="3"/>
+        </w:numPr>
+        <w:spacing w:after="90" w:line="290" w:lineRule="auto"/>
+      </w:pPr>
+      <w:r>
+        <w:rPr>
+          <w:b/>
+          <w:bCs/>
+        </w:rPr>
+        <w:t xml:space="preserve">Статичен IP: </w:t>
+      </w:r>
+      <w:r>
+        <w:t>Pi-то и LoRa gateway-ят получават статични IP адреси в локалната мрежа, зададени през самия рутер.</w:t>
+      </w:r>
+    </w:p>
+    <w:p>
+      <w:pPr>
+        <w:pStyle w:val="ListParagraph"/>
+        <w:numPr>
+          <w:ilvl w:val="0"/>
+          <w:numId w:val="3"/>
+        </w:numPr>
+        <w:spacing w:after="90" w:line="290" w:lineRule="auto"/>
+      </w:pPr>
+      <w:r>
+        <w:rPr>
+          <w:b/>
+          <w:bCs/>
+        </w:rPr>
+        <w:t xml:space="preserve">Отдалечен достъп: </w:t>
+      </w:r>
+      <w:r>
+        <w:t>за извън локалната мрежа може да се ползва Tailscale (WireGuard-базирана mesh VPN) — Pi-то е достъпно отвсякъде все едно е на LAN-а, без да се forward-ва порт на рутера навън (за разлика от директен port-forward на SSH порта, публично видим и сканиран от ботове в рамките на минути). Ограничаване на SSH достъпа само през Tailscale интерфейса (ufw) е опция, прилагана по преценка според обекта, не задължителна стъпка.</w:t>
+      </w:r>
+    </w:p>
+    <w:p>
+      <w:pPr>
+        <w:pStyle w:val="Heading1"/>
+        <w:numPr>
+          <w:ilvl w:val="0"/>
+          <w:numId w:val="2"/>
+        </w:numPr>
+        <w:pBdr>
+          <w:bottom w:val="single" w:sz="10" w:space="6" w:color="000000"/>
+        </w:pBdr>
+        <w:spacing w:before="420" w:after="180"/>
+      </w:pPr>
+      <w:r>
+        <w:rPr>
+          <w:b/>
+          <w:bCs/>
+          <w:color w:val="000000"/>
+          <w:sz w:val="30"/>
+          <w:szCs w:val="30"/>
+        </w:rPr>
+        <w:t>Архитектура на сървърния софтуер</w:t>
+      </w:r>
+    </w:p>
+    <w:p>
+      <w:pPr>
+        <w:spacing w:after="140" w:line="300" w:lineRule="auto"/>
+      </w:pPr>
+      <w:r>
+        <w:lastRenderedPageBreak/>
+        <w:t>Целият софтуер на сървъра работи като набор от Docker контейнери на Raspberry Pi. Съобщенията от gateway-я преминават през MQTT брокера към базата данни; три самостоятелни Python процеса (desired_state_setter.py, reconciler.py, health_checker.py) четат и пишат в нея; dashboard-ът (само за четене) обслужва потребителите.</w:t>
+      </w:r>
+    </w:p>
+    <w:p>
+      <w:pPr>
+        <w:pStyle w:val="Heading2"/>
+        <w:numPr>
+          <w:ilvl w:val="1"/>
+          <w:numId w:val="2"/>
+        </w:numPr>
+        <w:spacing w:before="320" w:after="140"/>
+      </w:pPr>
+      <w:r>
+        <w:rPr>
+          <w:b/>
+          <w:bCs/>
+          <w:color w:val="000000"/>
+          <w:sz w:val="25"/>
+          <w:szCs w:val="25"/>
+        </w:rPr>
+        <w:t>MQTT broker</w:t>
+      </w:r>
+    </w:p>
+    <w:p>
+      <w:pPr>
+        <w:pStyle w:val="ListParagraph"/>
+        <w:numPr>
+          <w:ilvl w:val="0"/>
+          <w:numId w:val="3"/>
+        </w:numPr>
+        <w:spacing w:after="90" w:line="290" w:lineRule="auto"/>
+      </w:pPr>
+      <w:r>
+        <w:t>Python скрипт чете приетата информация от сензорите по MQTT брокера и я записва в MySQL база данни, която групира няколко сензора заедно с една изпълнителна единица (напр. помпа) по уникалното им ID в една логическа зона.</w:t>
+      </w:r>
+    </w:p>
+    <w:p>
+      <w:pPr>
+        <w:pStyle w:val="ListParagraph"/>
+        <w:numPr>
+          <w:ilvl w:val="0"/>
+          <w:numId w:val="3"/>
+        </w:numPr>
+        <w:spacing w:after="90" w:line="290" w:lineRule="auto"/>
+      </w:pPr>
+      <w:r>
+        <w:t>Абониран е за топика със сензорни данни.</w:t>
+      </w:r>
+    </w:p>
+    <w:p>
+      <w:pPr>
+        <w:pStyle w:val="Heading2"/>
+        <w:numPr>
+          <w:ilvl w:val="1"/>
+          <w:numId w:val="2"/>
+        </w:numPr>
+        <w:spacing w:before="320" w:after="140"/>
+      </w:pPr>
+      <w:r>
+        <w:rPr>
+          <w:b/>
+          <w:bCs/>
+          <w:color w:val="000000"/>
+          <w:sz w:val="25"/>
+          <w:szCs w:val="25"/>
+        </w:rPr>
+        <w:t>MQTT теми и JSON формат на съобщенията</w:t>
+      </w:r>
+    </w:p>
+    <w:p>
+      <w:pPr>
+        <w:pStyle w:val="Heading3"/>
+        <w:numPr>
+          <w:ilvl w:val="2"/>
+          <w:numId w:val="2"/>
+        </w:numPr>
+        <w:spacing w:before="220" w:after="100"/>
+      </w:pPr>
+      <w:r>
+        <w:rPr>
+          <w:b/>
+          <w:bCs/>
+          <w:color w:val="000000"/>
+          <w:sz w:val="22"/>
+          <w:szCs w:val="22"/>
+        </w:rPr>
+        <w:t>Теми, публикувани КЪМ системата</w:t>
+      </w:r>
+    </w:p>
+    <w:p>
+      <w:pPr>
+        <w:pStyle w:val="ListParagraph"/>
+        <w:numPr>
+          <w:ilvl w:val="0"/>
+          <w:numId w:val="3"/>
+        </w:numPr>
+        <w:spacing w:after="90" w:line="290" w:lineRule="auto"/>
+      </w:pPr>
+      <w:r>
+        <w:rPr>
+          <w:b/>
+          <w:bCs/>
+        </w:rPr>
+        <w:t>commands</w:t>
+      </w:r>
+      <w:r>
+        <w:t xml:space="preserve"> — команда за executor (включи/изключи консуматор).</w:t>
+      </w:r>
+    </w:p>
+    <w:p>
+      <w:pPr>
+        <w:pStyle w:val="ListParagraph"/>
+        <w:numPr>
+          <w:ilvl w:val="0"/>
+          <w:numId w:val="3"/>
+        </w:numPr>
+        <w:spacing w:after="90" w:line="290" w:lineRule="auto"/>
+      </w:pPr>
+      <w:r>
+        <w:rPr>
+          <w:b/>
+          <w:bCs/>
+        </w:rPr>
+        <w:t>module_states_request</w:t>
+      </w:r>
+      <w:r>
+        <w:t xml:space="preserve"> — запитване за текущото ON/OFF състояние на всичките консуматори на един executor.</w:t>
+      </w:r>
+    </w:p>
+    <w:p>
+      <w:pPr>
+        <w:pStyle w:val="Heading3"/>
+        <w:numPr>
+          <w:ilvl w:val="2"/>
+          <w:numId w:val="2"/>
+        </w:numPr>
+        <w:spacing w:before="220" w:after="100"/>
+      </w:pPr>
+      <w:r>
+        <w:rPr>
+          <w:b/>
+          <w:bCs/>
+          <w:color w:val="000000"/>
+          <w:sz w:val="22"/>
+          <w:szCs w:val="22"/>
+        </w:rPr>
+        <w:t>Теми, публикувани ОТ системата</w:t>
+      </w:r>
+    </w:p>
+    <w:p>
+      <w:pPr>
+        <w:pStyle w:val="ListParagraph"/>
+        <w:numPr>
+          <w:ilvl w:val="0"/>
+          <w:numId w:val="3"/>
+        </w:numPr>
+        <w:spacing w:after="90" w:line="290" w:lineRule="auto"/>
+      </w:pPr>
+      <w:r>
+        <w:rPr>
+          <w:b/>
+          <w:bCs/>
+        </w:rPr>
+        <w:t>sensors</w:t>
+      </w:r>
+      <w:r>
+        <w:t xml:space="preserve"> — всяко sensor отчитане.</w:t>
+      </w:r>
+    </w:p>
+    <w:p>
+      <w:pPr>
+        <w:pStyle w:val="ListParagraph"/>
+        <w:numPr>
+          <w:ilvl w:val="0"/>
+          <w:numId w:val="3"/>
+        </w:numPr>
+        <w:spacing w:after="90" w:line="290" w:lineRule="auto"/>
+      </w:pPr>
+      <w:r>
+        <w:rPr>
+          <w:b/>
+          <w:bCs/>
+        </w:rPr>
+        <w:t>heartbeat</w:t>
+      </w:r>
+      <w:r>
+        <w:t xml:space="preserve"> — обединена тема за heartbeat-и от Repeater/Executor/Gateway.</w:t>
+      </w:r>
+    </w:p>
+    <w:p>
+      <w:pPr>
+        <w:pStyle w:val="ListParagraph"/>
+        <w:numPr>
+          <w:ilvl w:val="0"/>
+          <w:numId w:val="3"/>
+        </w:numPr>
+        <w:spacing w:after="90" w:line="290" w:lineRule="auto"/>
+      </w:pPr>
+      <w:r>
+        <w:rPr>
+          <w:b/>
+          <w:bCs/>
+        </w:rPr>
+        <w:t>commands_status</w:t>
+      </w:r>
+      <w:r>
+        <w:t xml:space="preserve"> — резултат на изпратена команда.</w:t>
+      </w:r>
+    </w:p>
+    <w:p>
+      <w:pPr>
+        <w:pStyle w:val="ListParagraph"/>
+        <w:numPr>
+          <w:ilvl w:val="0"/>
+          <w:numId w:val="3"/>
+        </w:numPr>
+        <w:spacing w:after="90" w:line="290" w:lineRule="auto"/>
+      </w:pPr>
+      <w:r>
+        <w:rPr>
+          <w:b/>
+          <w:bCs/>
+        </w:rPr>
+        <w:t>module_states_response</w:t>
+      </w:r>
+      <w:r>
+        <w:t xml:space="preserve"> — отговор на запитване за състояние.</w:t>
+      </w:r>
+    </w:p>
+    <w:p>
+      <w:pPr>
+        <w:pStyle w:val="Heading3"/>
+        <w:numPr>
+          <w:ilvl w:val="2"/>
+          <w:numId w:val="2"/>
+        </w:numPr>
+        <w:spacing w:before="220" w:after="100"/>
+      </w:pPr>
+      <w:r>
+        <w:rPr>
+          <w:b/>
+          <w:bCs/>
+          <w:color w:val="000000"/>
+          <w:sz w:val="22"/>
+          <w:szCs w:val="22"/>
+        </w:rPr>
+        <w:t>Примери</w:t>
+      </w:r>
+    </w:p>
+    <w:p>
+      <w:pPr>
+        <w:pBdr>
+          <w:top w:val="single" w:sz="4" w:space="0" w:color="CBD3CE"/>
+          <w:left w:val="single" w:sz="4" w:space="0" w:color="CBD3CE"/>
+          <w:bottom w:val="single" w:sz="4" w:space="0" w:color="CBD3CE"/>
+          <w:right w:val="single" w:sz="4" w:space="0" w:color="CBD3CE"/>
+        </w:pBdr>
+        <w:shd w:val="clear" w:color="auto" w:fill="F7F5F0"/>
+        <w:spacing w:after="160"/>
+      </w:pPr>
+      <w:r>
+        <w:rPr>
+          <w:rFonts w:ascii="Consolas" w:eastAsia="Consolas" w:hAnsi="Consolas" w:cs="Consolas"/>
+          <w:color w:val="2B3A34"/>
+          <w:sz w:val="18"/>
+          <w:szCs w:val="18"/>
+        </w:rPr>
+        <w:t>sensors: {"id":"S001","sT":23.4,"sH":45.2,"aT":22.1,"aH":50.3,"rssi":-42,"snr":9.5,"ts":1234}</w:t>
+      </w:r>
+    </w:p>
+    <w:p>
+      <w:pPr>
+        <w:spacing w:after="140" w:line="300" w:lineRule="auto"/>
+      </w:pPr>
+      <w:r>
+        <w:t>sT/sH/aT/aH са почва Т°/RH и въздух Т°/RH; rssi/snr — сила/качество на радио сигнала. ts е относително време (секунди от последния boot на Gateway-я, НЕ Unix timestamp) — истинското време на запис идва от момента, в който mqtt_bridge.py получи съобщението, не от ts. Стойност 255.0 във всяко поле означава невалидно показание за тоя цикъл.</w:t>
+      </w:r>
+    </w:p>
+    <w:p>
+      <w:pPr>
+        <w:pBdr>
+          <w:top w:val="single" w:sz="4" w:space="0" w:color="CBD3CE"/>
+          <w:left w:val="single" w:sz="4" w:space="0" w:color="CBD3CE"/>
+          <w:bottom w:val="single" w:sz="4" w:space="0" w:color="CBD3CE"/>
+          <w:right w:val="single" w:sz="4" w:space="0" w:color="CBD3CE"/>
+        </w:pBdr>
+        <w:shd w:val="clear" w:color="auto" w:fill="F7F5F0"/>
+        <w:spacing w:after="160"/>
+      </w:pPr>
+      <w:r>
+        <w:rPr>
+          <w:rFonts w:ascii="Consolas" w:eastAsia="Consolas" w:hAnsi="Consolas" w:cs="Consolas"/>
+          <w:color w:val="2B3A34"/>
+          <w:sz w:val="18"/>
+          <w:szCs w:val="18"/>
+        </w:rPr>
+        <w:t>commands: {"M_ID":"E001","C_ID":"V01","com":"A1"}</w:t>
+      </w:r>
+    </w:p>
+    <w:p>
+      <w:pPr>
+        <w:spacing w:after="140" w:line="300" w:lineRule="auto"/>
+      </w:pPr>
+      <w:r>
+        <w:t>com е hex команден код: „A1“ = включи, „B2“ = изключи. commands_status добавя status: 0 = ACK (изпълнена), 1 = TIMEOUT (без отговор след до 2 повторни опита, общо ~12 сек), 2 = NACK (отхвърлена — непознат консуматор или невалидна команда).</w:t>
+      </w:r>
+    </w:p>
+    <w:p>
+      <w:pPr>
+        <w:pBdr>
+          <w:top w:val="single" w:sz="4" w:space="0" w:color="CBD3CE"/>
+          <w:left w:val="single" w:sz="4" w:space="0" w:color="CBD3CE"/>
+          <w:bottom w:val="single" w:sz="4" w:space="0" w:color="CBD3CE"/>
+          <w:right w:val="single" w:sz="4" w:space="0" w:color="CBD3CE"/>
+        </w:pBdr>
+        <w:shd w:val="clear" w:color="auto" w:fill="F7F5F0"/>
+        <w:spacing w:after="160"/>
+      </w:pPr>
+      <w:r>
+        <w:rPr>
+          <w:rFonts w:ascii="Consolas" w:eastAsia="Consolas" w:hAnsi="Consolas" w:cs="Consolas"/>
+          <w:color w:val="2B3A34"/>
+          <w:sz w:val="18"/>
+          <w:szCs w:val="18"/>
+        </w:rPr>
+        <w:t>module_states_request/response: {"M_ID":"E001"} → {"id":"E001","states":[{"id":"V01","state":"ON"}, ...]}</w:t>
+      </w:r>
+    </w:p>
+    <w:p>
+      <w:pPr>
+        <w:spacing w:after="140" w:line="300" w:lineRule="auto"/>
+      </w:pPr>
+      <w:r>
+        <w:t>При липса на отговор: {"id":"E001","status":"timeout"}. heartbeat форматът леко се различава по устройство — от Repeater носи и rssi/snr, от Executor и Gateway само id+ts (различават се по наличието на тия полета, не по изричен маркер за тип).</w:t>
+      </w:r>
+    </w:p>
+    <w:p>
+      <w:pPr>
+        <w:pStyle w:val="ListParagraph"/>
+        <w:numPr>
+          <w:ilvl w:val="0"/>
+          <w:numId w:val="3"/>
+        </w:numPr>
+        <w:spacing w:after="90" w:line="290" w:lineRule="auto"/>
+      </w:pPr>
+      <w:r>
+        <w:t>Всички MQTT съобщения, публикувани от системата, вече отразяват декриптирани и автентицирани данни — mqtt_bridge.py не прави собствена проверка на радио ниво, само на самия JSON формат.</w:t>
+      </w:r>
+    </w:p>
+    <w:p>
+      <w:pPr>
+        <w:pStyle w:val="ListParagraph"/>
+        <w:numPr>
+          <w:ilvl w:val="0"/>
+          <w:numId w:val="3"/>
+        </w:numPr>
+        <w:spacing w:after="90" w:line="290" w:lineRule="auto"/>
+      </w:pPr>
+      <w:r>
+        <w:t>Module ID-тата (M_ID/id) са до 6 символа; consumer ID-тата (C_ID) са до 4.</w:t>
       </w:r>
     </w:p>
     <w:p>
@@ -1128,288 +1814,7 @@
           <w:szCs w:val="25"/>
         </w:rPr>
         <w:lastRenderedPageBreak/>
-        <w:t>Repeater</w:t>
-      </w:r>
-    </w:p>
-    <w:p>
-      <w:pPr>
-        <w:pStyle w:val="ListParagraph"/>
-        <w:numPr>
-          <w:ilvl w:val="0"/>
-          <w:numId w:val="3"/>
-        </w:numPr>
-        <w:spacing w:after="90" w:line="290" w:lineRule="auto"/>
-      </w:pPr>
-      <w:r>
-        <w:t>Чете всяко съобщение на втората работна честота (тая, на която предават sensor-ите избрали „през Repeater“) и го препраща на основната честота, на която слуша Gateway-ят.</w:t>
-      </w:r>
-    </w:p>
-    <w:p>
-      <w:pPr>
-        <w:pStyle w:val="ListParagraph"/>
-        <w:numPr>
-          <w:ilvl w:val="0"/>
-          <w:numId w:val="3"/>
-        </w:numPr>
-        <w:spacing w:after="90" w:line="290" w:lineRule="auto"/>
-      </w:pPr>
-      <w:r>
-        <w:rPr>
-          <w:b/>
-          <w:bCs/>
-        </w:rPr>
-        <w:t xml:space="preserve">Дедупликация: </w:t>
-      </w:r>
-      <w:r>
-        <w:t>за да не се получи дублирано препращане (напр. два Repeater-а чуват един и същ sensor пакет) — всеки Repeater пази кратка памет за наскоро препратени пакети и отказва да препрати нещо, което вече е препратил, или нещо, което вече носи белег, че е препратено от друг Repeater (собствен маркер байт в края на пакета).</w:t>
-      </w:r>
-    </w:p>
-    <w:p>
-      <w:pPr>
-        <w:pStyle w:val="ListParagraph"/>
-        <w:numPr>
-          <w:ilvl w:val="0"/>
-          <w:numId w:val="3"/>
-        </w:numPr>
-        <w:spacing w:after="90" w:line="290" w:lineRule="auto"/>
-      </w:pPr>
-      <w:r>
-        <w:rPr>
-          <w:b/>
-          <w:bCs/>
-        </w:rPr>
-        <w:t xml:space="preserve">CAD: </w:t>
-      </w:r>
-      <w:r>
-        <w:t>непосредствено преди да предаде каквото и да е (препратен пакет или собствен heartbeat), проверява дали радио каналът е свободен (Channel Activity Detection) — ако е зает, изчаква и опитва отново малко по-късно.</w:t>
-      </w:r>
-    </w:p>
-    <w:p>
-      <w:pPr>
-        <w:pStyle w:val="ListParagraph"/>
-        <w:numPr>
-          <w:ilvl w:val="0"/>
-          <w:numId w:val="3"/>
-        </w:numPr>
-        <w:spacing w:after="90" w:line="290" w:lineRule="auto"/>
-      </w:pPr>
-      <w:r>
-        <w:t>Изпраща и собствен heartbeat периодично.</w:t>
-      </w:r>
-    </w:p>
-    <w:p>
-      <w:pPr>
-        <w:pStyle w:val="Heading2"/>
-        <w:numPr>
-          <w:ilvl w:val="1"/>
-          <w:numId w:val="2"/>
-        </w:numPr>
-        <w:spacing w:before="320" w:after="140"/>
-      </w:pPr>
-      <w:r>
-        <w:rPr>
-          <w:b/>
-          <w:bCs/>
-          <w:color w:val="000000"/>
-          <w:sz w:val="25"/>
-          <w:szCs w:val="25"/>
-        </w:rPr>
-        <w:t>LoRa Gateway (TTGO)</w:t>
-      </w:r>
-    </w:p>
-    <w:p>
-      <w:pPr>
-        <w:pStyle w:val="ListParagraph"/>
-        <w:numPr>
-          <w:ilvl w:val="0"/>
-          <w:numId w:val="3"/>
-        </w:numPr>
-        <w:spacing w:after="90" w:line="290" w:lineRule="auto"/>
-      </w:pPr>
-      <w:r>
-        <w:t>Някакъв watchdog като цяло — софтуерен или хардуерен.</w:t>
-      </w:r>
-    </w:p>
-    <w:p>
-      <w:pPr>
-        <w:pStyle w:val="ListParagraph"/>
-        <w:numPr>
-          <w:ilvl w:val="0"/>
-          <w:numId w:val="3"/>
-        </w:numPr>
-        <w:spacing w:after="90" w:line="290" w:lineRule="auto"/>
-      </w:pPr>
-      <w:r>
-        <w:t>Чете LoRa съобщение — ако е информация от сензори, я препраща към MQTT broker; в същото време очаква команда за препращане.</w:t>
-      </w:r>
-    </w:p>
-    <w:p>
-      <w:pPr>
-        <w:pStyle w:val="ListParagraph"/>
-        <w:numPr>
-          <w:ilvl w:val="0"/>
-          <w:numId w:val="3"/>
-        </w:numPr>
-        <w:spacing w:after="90" w:line="290" w:lineRule="auto"/>
-      </w:pPr>
-      <w:r>
-        <w:rPr>
-          <w:b/>
-          <w:bCs/>
-        </w:rPr>
-        <w:t xml:space="preserve">Буфериране: </w:t>
-      </w:r>
-      <w:r>
-        <w:t>ако мрежата спре, запазва в буфер последните данни от сензорите (напр. ако сървърът е на друго място).</w:t>
-      </w:r>
-    </w:p>
-    <w:p>
-      <w:pPr>
-        <w:pStyle w:val="ListParagraph"/>
-        <w:numPr>
-          <w:ilvl w:val="0"/>
-          <w:numId w:val="3"/>
-        </w:numPr>
-        <w:spacing w:after="90" w:line="290" w:lineRule="auto"/>
-      </w:pPr>
-      <w:r>
-        <w:rPr>
-          <w:b/>
-          <w:bCs/>
-        </w:rPr>
-        <w:t xml:space="preserve">Software watchdog за WiFi/MQTT: </w:t>
-      </w:r>
-      <w:r>
-        <w:t>ако MQTT връзката отпадне за &gt;N секунди — форсиран ESP.restart().</w:t>
-      </w:r>
-    </w:p>
-    <w:p>
-      <w:pPr>
-        <w:pStyle w:val="ListParagraph"/>
-        <w:numPr>
-          <w:ilvl w:val="0"/>
-          <w:numId w:val="3"/>
-        </w:numPr>
-        <w:spacing w:after="90" w:line="290" w:lineRule="auto"/>
-      </w:pPr>
-      <w:r>
-        <w:t>При команда — изпраща в топика за обратна връзка резултата от изпълнението ѝ.</w:t>
-      </w:r>
-    </w:p>
-    <w:p>
-      <w:pPr>
-        <w:pStyle w:val="Heading2"/>
-        <w:numPr>
-          <w:ilvl w:val="1"/>
-          <w:numId w:val="2"/>
-        </w:numPr>
-        <w:spacing w:before="320" w:after="140"/>
-      </w:pPr>
-      <w:r>
-        <w:rPr>
-          <w:b/>
-          <w:bCs/>
-          <w:color w:val="000000"/>
-          <w:sz w:val="25"/>
-          <w:szCs w:val="25"/>
-        </w:rPr>
-        <w:t>Server — Raspberry Pi</w:t>
-      </w:r>
-    </w:p>
-    <w:p>
-      <w:pPr>
-        <w:pStyle w:val="ListParagraph"/>
-        <w:numPr>
-          <w:ilvl w:val="0"/>
-          <w:numId w:val="3"/>
-        </w:numPr>
-        <w:spacing w:after="90" w:line="290" w:lineRule="auto"/>
-      </w:pPr>
-      <w:r>
-        <w:t>Raspberry Pi 4/5 — SSH remote достъп, watchdog на самото Pi (софтуерен или хардуерен).</w:t>
-      </w:r>
-    </w:p>
-    <w:p>
-      <w:pPr>
-        <w:pStyle w:val="ListParagraph"/>
-        <w:numPr>
-          <w:ilvl w:val="0"/>
-          <w:numId w:val="3"/>
-        </w:numPr>
-        <w:spacing w:after="90" w:line="290" w:lineRule="auto"/>
-      </w:pPr>
-      <w:r>
-        <w:rPr>
-          <w:b/>
-          <w:bCs/>
-        </w:rPr>
-        <w:t xml:space="preserve">Деплоймънт през SSH: </w:t>
-      </w:r>
-      <w:r>
-        <w:t>копирането на deploy/ папката (docker-compose.yml, .env, mosquitto.conf, mosquitto_passwd) става с rsync през SSH сесия; инсталацията/ъпдейтът (docker compose up -d, docker compose pull &amp;&amp; docker compose up -d) се изпълняват директно на Pi-то през активна SSH връзка. SSH каналът е вече криптиран end-to-end, затова не е нужен допълнителен HTTPS слой специално за самия deployment процес.</w:t>
-      </w:r>
-    </w:p>
-    <w:p>
-      <w:pPr>
-        <w:pStyle w:val="ListParagraph"/>
-        <w:numPr>
-          <w:ilvl w:val="0"/>
-          <w:numId w:val="3"/>
-        </w:numPr>
-        <w:spacing w:after="90" w:line="290" w:lineRule="auto"/>
-      </w:pPr>
-      <w:r>
-        <w:rPr>
-          <w:b/>
-          <w:bCs/>
-        </w:rPr>
-        <w:t xml:space="preserve">Статичен IP: </w:t>
-      </w:r>
-      <w:r>
-        <w:t>Pi-то и LoRa gateway-ят получават статични IP адреси в локалната мрежа, зададени през самия рутер.</w:t>
-      </w:r>
-    </w:p>
-    <w:p>
-      <w:pPr>
-        <w:pStyle w:val="ListParagraph"/>
-        <w:numPr>
-          <w:ilvl w:val="0"/>
-          <w:numId w:val="3"/>
-        </w:numPr>
-        <w:spacing w:after="90" w:line="290" w:lineRule="auto"/>
-      </w:pPr>
-      <w:r>
-        <w:rPr>
-          <w:b/>
-          <w:bCs/>
-        </w:rPr>
-        <w:t xml:space="preserve">Отдалечен достъп: </w:t>
-      </w:r>
-      <w:r>
-        <w:t>за извън локалната мрежа може да се ползва Tailscale (WireGuard-базирана mesh VPN) — Pi-то е достъпно отвсякъде все едно е на LAN-а, без да се forward-ва порт на рутера навън (за разлика от директен port-forward на SSH порта, публично видим и сканиран от ботове в рамките на минути). Ограничаване на SSH достъпа само през Tailscale интерфейса (ufw) е опция, прилагана по преценка според обекта, не задължителна стъпка.</w:t>
-      </w:r>
-    </w:p>
-    <w:p>
-      <w:pPr>
-        <w:pStyle w:val="Heading1"/>
-        <w:numPr>
-          <w:ilvl w:val="0"/>
-          <w:numId w:val="2"/>
-        </w:numPr>
-        <w:pBdr>
-          <w:bottom w:val="single" w:sz="10" w:space="6" w:color="000000"/>
-        </w:pBdr>
-        <w:spacing w:before="420" w:after="180"/>
-      </w:pPr>
-      <w:r>
-        <w:rPr>
-          <w:b/>
-          <w:bCs/>
-          <w:color w:val="000000"/>
-          <w:sz w:val="30"/>
-          <w:szCs w:val="30"/>
-        </w:rPr>
-        <w:t>Архитектура на сървърния софтуер</w:t>
+        <w:t>Backend (бизнес логика) на Python</w:t>
       </w:r>
     </w:p>
     <w:p>
@@ -1417,395 +1822,7 @@
         <w:spacing w:after="140" w:line="300" w:lineRule="auto"/>
       </w:pPr>
       <w:r>
-        <w:t>Целият софтуер на сървъра работи като набор от Docker контейнери на Raspberry Pi. Съобщенията от gateway-я преминават през MQTT брокера към базата данни; три самостоятелни Python процеса (desired_state_setter.py, reconciler.py, health_checker.py) четат и пишат в нея; dashboard-ът (само за четене) обслужва потребителите.</w:t>
-      </w:r>
-    </w:p>
-    <w:p>
-      <w:pPr>
-        <w:pStyle w:val="Heading2"/>
-        <w:numPr>
-          <w:ilvl w:val="1"/>
-          <w:numId w:val="2"/>
-        </w:numPr>
-        <w:spacing w:before="320" w:after="140"/>
-      </w:pPr>
-      <w:r>
-        <w:rPr>
-          <w:b/>
-          <w:bCs/>
-          <w:color w:val="000000"/>
-          <w:sz w:val="25"/>
-          <w:szCs w:val="25"/>
-        </w:rPr>
-        <w:lastRenderedPageBreak/>
-        <w:t>MQTT broker</w:t>
-      </w:r>
-    </w:p>
-    <w:p>
-      <w:pPr>
-        <w:pStyle w:val="ListParagraph"/>
-        <w:numPr>
-          <w:ilvl w:val="0"/>
-          <w:numId w:val="3"/>
-        </w:numPr>
-        <w:spacing w:after="90" w:line="290" w:lineRule="auto"/>
-      </w:pPr>
-      <w:r>
-        <w:t>Python скрипт чете приетата информация от сензорите по MQTT брокера и я записва в MySQL база данни, която групира няколко сензора заедно с една изпълнителна единица (напр. помпа) по уникалното им ID в една логическа зона.</w:t>
-      </w:r>
-    </w:p>
-    <w:p>
-      <w:pPr>
-        <w:pStyle w:val="ListParagraph"/>
-        <w:numPr>
-          <w:ilvl w:val="0"/>
-          <w:numId w:val="3"/>
-        </w:numPr>
-        <w:spacing w:after="90" w:line="290" w:lineRule="auto"/>
-      </w:pPr>
-      <w:r>
-        <w:t>Абониран е за топика със сензорни данни.</w:t>
-      </w:r>
-    </w:p>
-    <w:p>
-      <w:pPr>
-        <w:pStyle w:val="Heading2"/>
-        <w:numPr>
-          <w:ilvl w:val="1"/>
-          <w:numId w:val="2"/>
-        </w:numPr>
-        <w:spacing w:before="320" w:after="140"/>
-      </w:pPr>
-      <w:r>
-        <w:rPr>
-          <w:b/>
-          <w:bCs/>
-          <w:color w:val="000000"/>
-          <w:sz w:val="25"/>
-          <w:szCs w:val="25"/>
-        </w:rPr>
-        <w:t>MQTT теми и JSON формат на съобщенията</w:t>
-      </w:r>
-    </w:p>
-    <w:p>
-      <w:pPr>
-        <w:pStyle w:val="Heading3"/>
-        <w:numPr>
-          <w:ilvl w:val="2"/>
-          <w:numId w:val="2"/>
-        </w:numPr>
-        <w:spacing w:before="220" w:after="100"/>
-      </w:pPr>
-      <w:r>
-        <w:rPr>
-          <w:b/>
-          <w:bCs/>
-          <w:color w:val="000000"/>
-          <w:sz w:val="22"/>
-          <w:szCs w:val="22"/>
-        </w:rPr>
-        <w:t>Теми, публикувани КЪМ системата</w:t>
-      </w:r>
-    </w:p>
-    <w:p>
-      <w:pPr>
-        <w:pStyle w:val="ListParagraph"/>
-        <w:numPr>
-          <w:ilvl w:val="0"/>
-          <w:numId w:val="3"/>
-        </w:numPr>
-        <w:spacing w:after="90" w:line="290" w:lineRule="auto"/>
-      </w:pPr>
-      <w:r>
-        <w:rPr>
-          <w:b/>
-          <w:bCs/>
-        </w:rPr>
-        <w:t>commands</w:t>
-      </w:r>
-      <w:r>
-        <w:t xml:space="preserve"> — команда за executor (включи/изключи консуматор).</w:t>
-      </w:r>
-    </w:p>
-    <w:p>
-      <w:pPr>
-        <w:pStyle w:val="ListParagraph"/>
-        <w:numPr>
-          <w:ilvl w:val="0"/>
-          <w:numId w:val="3"/>
-        </w:numPr>
-        <w:spacing w:after="90" w:line="290" w:lineRule="auto"/>
-      </w:pPr>
-      <w:r>
-        <w:rPr>
-          <w:b/>
-          <w:bCs/>
-        </w:rPr>
-        <w:t>module_states_request</w:t>
-      </w:r>
-      <w:r>
-        <w:t xml:space="preserve"> — запитване за текущото ON/OFF състояние на всичките консуматори на един executor.</w:t>
-      </w:r>
-    </w:p>
-    <w:p>
-      <w:pPr>
-        <w:pStyle w:val="Heading3"/>
-        <w:numPr>
-          <w:ilvl w:val="2"/>
-          <w:numId w:val="2"/>
-        </w:numPr>
-        <w:spacing w:before="220" w:after="100"/>
-      </w:pPr>
-      <w:r>
-        <w:rPr>
-          <w:b/>
-          <w:bCs/>
-          <w:color w:val="000000"/>
-          <w:sz w:val="22"/>
-          <w:szCs w:val="22"/>
-        </w:rPr>
-        <w:t>Теми, публикувани ОТ системата</w:t>
-      </w:r>
-    </w:p>
-    <w:p>
-      <w:pPr>
-        <w:pStyle w:val="ListParagraph"/>
-        <w:numPr>
-          <w:ilvl w:val="0"/>
-          <w:numId w:val="3"/>
-        </w:numPr>
-        <w:spacing w:after="90" w:line="290" w:lineRule="auto"/>
-      </w:pPr>
-      <w:r>
-        <w:rPr>
-          <w:b/>
-          <w:bCs/>
-        </w:rPr>
-        <w:t>sensors</w:t>
-      </w:r>
-      <w:r>
-        <w:t xml:space="preserve"> — всяко sensor отчитане.</w:t>
-      </w:r>
-    </w:p>
-    <w:p>
-      <w:pPr>
-        <w:pStyle w:val="ListParagraph"/>
-        <w:numPr>
-          <w:ilvl w:val="0"/>
-          <w:numId w:val="3"/>
-        </w:numPr>
-        <w:spacing w:after="90" w:line="290" w:lineRule="auto"/>
-      </w:pPr>
-      <w:r>
-        <w:rPr>
-          <w:b/>
-          <w:bCs/>
-        </w:rPr>
-        <w:t>heartbeat</w:t>
-      </w:r>
-      <w:r>
-        <w:t xml:space="preserve"> — обединена тема за heartbeat-и от Repeater/Executor/Gateway.</w:t>
-      </w:r>
-    </w:p>
-    <w:p>
-      <w:pPr>
-        <w:pStyle w:val="ListParagraph"/>
-        <w:numPr>
-          <w:ilvl w:val="0"/>
-          <w:numId w:val="3"/>
-        </w:numPr>
-        <w:spacing w:after="90" w:line="290" w:lineRule="auto"/>
-      </w:pPr>
-      <w:r>
-        <w:rPr>
-          <w:b/>
-          <w:bCs/>
-        </w:rPr>
-        <w:t>commands_status</w:t>
-      </w:r>
-      <w:r>
-        <w:t xml:space="preserve"> — резултат на изпратена команда.</w:t>
-      </w:r>
-    </w:p>
-    <w:p>
-      <w:pPr>
-        <w:pStyle w:val="ListParagraph"/>
-        <w:numPr>
-          <w:ilvl w:val="0"/>
-          <w:numId w:val="3"/>
-        </w:numPr>
-        <w:spacing w:after="90" w:line="290" w:lineRule="auto"/>
-      </w:pPr>
-      <w:r>
-        <w:rPr>
-          <w:b/>
-          <w:bCs/>
-        </w:rPr>
-        <w:t>module_states_response</w:t>
-      </w:r>
-      <w:r>
-        <w:t xml:space="preserve"> — отговор на запитване за състояние.</w:t>
-      </w:r>
-    </w:p>
-    <w:p>
-      <w:pPr>
-        <w:pStyle w:val="Heading3"/>
-        <w:numPr>
-          <w:ilvl w:val="2"/>
-          <w:numId w:val="2"/>
-        </w:numPr>
-        <w:spacing w:before="220" w:after="100"/>
-      </w:pPr>
-      <w:r>
-        <w:rPr>
-          <w:b/>
-          <w:bCs/>
-          <w:color w:val="000000"/>
-          <w:sz w:val="22"/>
-          <w:szCs w:val="22"/>
-        </w:rPr>
-        <w:t>Примери</w:t>
-      </w:r>
-    </w:p>
-    <w:p>
-      <w:pPr>
-        <w:pBdr>
-          <w:top w:val="single" w:sz="4" w:space="0" w:color="CBD3CE"/>
-          <w:left w:val="single" w:sz="4" w:space="0" w:color="CBD3CE"/>
-          <w:bottom w:val="single" w:sz="4" w:space="0" w:color="CBD3CE"/>
-          <w:right w:val="single" w:sz="4" w:space="0" w:color="CBD3CE"/>
-        </w:pBdr>
-        <w:shd w:val="clear" w:color="auto" w:fill="F7F5F0"/>
-        <w:spacing w:after="160"/>
-      </w:pPr>
-      <w:r>
-        <w:rPr>
-          <w:rFonts w:ascii="Consolas" w:eastAsia="Consolas" w:hAnsi="Consolas" w:cs="Consolas"/>
-          <w:color w:val="2B3A34"/>
-          <w:sz w:val="18"/>
-          <w:szCs w:val="18"/>
-        </w:rPr>
-        <w:t>sensors: {"id":"S001","sT":23.4,"sH":45.2,"aT":22.1,"aH":50.3,"rssi":-42,"snr":9.5,"ts":1234}</w:t>
-      </w:r>
-    </w:p>
-    <w:p>
-      <w:pPr>
-        <w:spacing w:after="140" w:line="300" w:lineRule="auto"/>
-      </w:pPr>
-      <w:r>
-        <w:t>sT/sH/aT/aH са почва Т°/RH и въздух Т°/RH; rssi/snr — сила/качество на радио сигнала. ts е относително време (секунди от последния boot на Gateway-я, НЕ Unix timestamp) — истинското време на запис идва от момента, в който mqtt_bridge.py получи съобщението, не от ts. Стойност 255.0 във всяко поле означава невалидно показание за тоя цикъл.</w:t>
-      </w:r>
-    </w:p>
-    <w:p>
-      <w:pPr>
-        <w:pBdr>
-          <w:top w:val="single" w:sz="4" w:space="0" w:color="CBD3CE"/>
-          <w:left w:val="single" w:sz="4" w:space="0" w:color="CBD3CE"/>
-          <w:bottom w:val="single" w:sz="4" w:space="0" w:color="CBD3CE"/>
-          <w:right w:val="single" w:sz="4" w:space="0" w:color="CBD3CE"/>
-        </w:pBdr>
-        <w:shd w:val="clear" w:color="auto" w:fill="F7F5F0"/>
-        <w:spacing w:after="160"/>
-      </w:pPr>
-      <w:r>
-        <w:rPr>
-          <w:rFonts w:ascii="Consolas" w:eastAsia="Consolas" w:hAnsi="Consolas" w:cs="Consolas"/>
-          <w:color w:val="2B3A34"/>
-          <w:sz w:val="18"/>
-          <w:szCs w:val="18"/>
-        </w:rPr>
-        <w:t>commands: {"M_ID":"E001","C_ID":"V01","com":"A1"}</w:t>
-      </w:r>
-    </w:p>
-    <w:p>
-      <w:pPr>
-        <w:spacing w:after="140" w:line="300" w:lineRule="auto"/>
-      </w:pPr>
-      <w:r>
-        <w:t>com е hex команден код: „A1“ = включи, „B2“ = изключи. commands_status добавя status: 0 = ACK (изпълнена), 1 = TIMEOUT (без отговор след до 2 повторни опита, общо ~12 сек), 2 = NACK (отхвърлена — непознат консуматор или невалидна команда).</w:t>
-      </w:r>
-    </w:p>
-    <w:p>
-      <w:pPr>
-        <w:pBdr>
-          <w:top w:val="single" w:sz="4" w:space="0" w:color="CBD3CE"/>
-          <w:left w:val="single" w:sz="4" w:space="0" w:color="CBD3CE"/>
-          <w:bottom w:val="single" w:sz="4" w:space="0" w:color="CBD3CE"/>
-          <w:right w:val="single" w:sz="4" w:space="0" w:color="CBD3CE"/>
-        </w:pBdr>
-        <w:shd w:val="clear" w:color="auto" w:fill="F7F5F0"/>
-        <w:spacing w:after="160"/>
-      </w:pPr>
-      <w:r>
-        <w:rPr>
-          <w:rFonts w:ascii="Consolas" w:eastAsia="Consolas" w:hAnsi="Consolas" w:cs="Consolas"/>
-          <w:color w:val="2B3A34"/>
-          <w:sz w:val="18"/>
-          <w:szCs w:val="18"/>
-        </w:rPr>
-        <w:t>module_states_request/response: {"M_ID":"E001"} → {"id":"E001","states":[{"id":"V01","state":"ON"}, ...]}</w:t>
-      </w:r>
-    </w:p>
-    <w:p>
-      <w:pPr>
-        <w:spacing w:after="140" w:line="300" w:lineRule="auto"/>
-      </w:pPr>
-      <w:r>
-        <w:t>При липса на отговор: {"id":"E001","status":"timeout"}. heartbeat форматът леко се различава по устройство — от Repeater носи и rssi/snr, от Executor и Gateway само id+ts (различават се по наличието на тия полета, не по изричен маркер за тип).</w:t>
-      </w:r>
-    </w:p>
-    <w:p>
-      <w:pPr>
-        <w:pStyle w:val="ListParagraph"/>
-        <w:numPr>
-          <w:ilvl w:val="0"/>
-          <w:numId w:val="3"/>
-        </w:numPr>
-        <w:spacing w:after="90" w:line="290" w:lineRule="auto"/>
-      </w:pPr>
-      <w:r>
-        <w:t>Всички MQTT съобщения, публикувани от системата, вече отразяват декриптирани и автентицирани данни — mqtt_bridge.py не прави собствена проверка на радио ниво, само на самия JSON формат.</w:t>
-      </w:r>
-    </w:p>
-    <w:p>
-      <w:pPr>
-        <w:pStyle w:val="ListParagraph"/>
-        <w:numPr>
-          <w:ilvl w:val="0"/>
-          <w:numId w:val="3"/>
-        </w:numPr>
-        <w:spacing w:after="90" w:line="290" w:lineRule="auto"/>
-      </w:pPr>
-      <w:r>
-        <w:t>Module ID-тата (M_ID/id) са до 6 символа; consumer ID-тата (C_ID) са до 4.</w:t>
-      </w:r>
-    </w:p>
-    <w:p>
-      <w:pPr>
-        <w:pStyle w:val="Heading2"/>
-        <w:numPr>
-          <w:ilvl w:val="1"/>
-          <w:numId w:val="2"/>
-        </w:numPr>
-        <w:spacing w:before="320" w:after="140"/>
-      </w:pPr>
-      <w:r>
-        <w:rPr>
-          <w:b/>
-          <w:bCs/>
-          <w:color w:val="000000"/>
-          <w:sz w:val="25"/>
-          <w:szCs w:val="25"/>
-        </w:rPr>
-        <w:t>Backend (бизнес логика) на Python</w:t>
-      </w:r>
-    </w:p>
-    <w:p>
-      <w:pPr>
-        <w:spacing w:after="140" w:line="300" w:lineRule="auto"/>
-      </w:pPr>
-      <w:r>
-        <w:t>Основната система за обработка на данни и вземане на решения. Логическите зони имат 3 режима на управление: ръчен, по часовник и по прагови стойности.</w:t>
+        <w:t>Основната система за обработка на данни и вземане на решения. Логическите зони имат 3 режима на управление: ръчен, по време и по прагови стойности.</w:t>
       </w:r>
     </w:p>
     <w:p>
@@ -1842,8 +1859,7 @@
           <w:b/>
           <w:bCs/>
         </w:rPr>
-        <w:lastRenderedPageBreak/>
-        <w:t xml:space="preserve">По часовник: </w:t>
+        <w:t xml:space="preserve">По време: </w:t>
       </w:r>
       <w:r>
         <w:t>клапаните се включват/изключват на предварително зададени часови интервали през деня (възможни са няколко интервала на ден).</w:t>
@@ -1886,7 +1902,7 @@
         <w:t xml:space="preserve">Прекъсване на автоматика: </w:t>
       </w:r>
       <w:r>
-        <w:t>ръчен бутон може да прекъсне работата на автоматичния „по часовник“ режим временно, но за автоматичния „по прагове“ трябва изцяло да се прекъсне (смяна на режим).</w:t>
+        <w:t>ръчен бутон може да прекъсне работата на автоматичния „по време“ режим временно, но за автоматичния „по прагове“ трябва изцяло да се прекъсне (смяна на режим).</w:t>
       </w:r>
     </w:p>
     <w:p>
@@ -1903,7 +1919,7 @@
           <w:b/>
           <w:bCs/>
         </w:rPr>
-        <w:t xml:space="preserve">Override при „по часовник“: </w:t>
+        <w:t xml:space="preserve">Override при „по време“: </w:t>
       </w:r>
       <w:r>
         <w:t>ръчна команда към клапан временно измества графика само за текущия интервал (override_phase помни дали клапанът бе вътре/извън интервала при подаване на командата) — контролът се връща на графика автоматично щом интервалът приключи/започне.</w:t>
@@ -1966,7 +1982,7 @@
         <w:t xml:space="preserve">Лимит на помпа: </w:t>
       </w:r>
       <w:r>
-        <w:t>всяка помпа захранва множество клапани, но има ограничение колко клапана могат да са отворени едновременно (max_simultaneous_valves). При ръчен режим и по часовник системата проверява ограничението предварително и сигнализира грешка при нарушение. При по прагове — зоните чакат на опашка по приоритет (първо тая, чийто сензор пръв е сигнализирал нужда); щом клапан приключи и освободи място, следващият в опашката се активира.</w:t>
+        <w:t>всяка помпа захранва множество клапани, но има ограничение колко клапана могат да са отворени едновременно (max_simultaneous_valves). При ръчен режим и по време системата проверява ограничението предварително и сигнализира грешка при нарушение. При по прагове — зоните чакат на опашка по приоритет (първо тая, чийто сензор пръв е сигнализирал нужда); щом клапан приключи и освободи място, следващият в опашката се активира.</w:t>
       </w:r>
     </w:p>
     <w:p>
@@ -2052,7 +2068,11 @@
         <w:spacing w:after="140" w:line="290" w:lineRule="auto"/>
       </w:pPr>
       <w:r>
-        <w:t>reconciler.py — основният контролен цикъл. На всеки няколко секунди сравнява desired_state с current_state за всеки клапан и помпа. При разлика прилага последователността „помпа изкл. → промяна на клапан(и) → помпа вкл. (ако има отворени клапани)“: праща MQTT команда и записва нов ред в valve_commands/pump_commands със статус pending. При потвърждение (ACK) от модула обновява current_state, current_updated_at и статуса на командата на success. Абониран е за MQTT топика с обратна връзка за изпълнение на команди. При стартиране (включително след рестарт) презасича вече съществуващите разлики между desired_state и current_state от преди прекъсването — цикълът е изцяло реактивен на текущото състояние в базата, не на паметта на процеса.</w:t>
+        <w:t xml:space="preserve">reconciler.py — основният контролен цикъл. На всеки няколко секунди сравнява desired_state с current_state за всеки клапан и помпа. При разлика прилага последователността „помпа изкл. → промяна на клапан(и) → помпа вкл. (ако има отворени клапани)“: праща MQTT команда и записва нов ред в valve_commands/pump_commands със статус pending. При потвърждение (ACK) от модула обновява current_state, current_updated_at и статуса на командата на success. Абониран е за MQTT </w:t>
+      </w:r>
+      <w:r>
+        <w:lastRenderedPageBreak/>
+        <w:t>топика с обратна връзка за изпълнение на команди. При стартиране (включително след рестарт) презасича вече съществуващите разлики между desired_state и current_state от преди прекъсването — цикълът е изцяло реактивен на текущото състояние в базата, не на паметта на процеса.</w:t>
       </w:r>
     </w:p>
     <w:p>
@@ -2065,7 +2085,6 @@
         <w:spacing w:after="140" w:line="290" w:lineRule="auto"/>
       </w:pPr>
       <w:r>
-        <w:lastRenderedPageBreak/>
         <w:t>health_checker.py — следи за грешки, работи по-рядко (напр. на 30–60 сек). Проверява неразрешени забавяния в valve_commands/pump_commands (само чете, не ги пипа), сензорни аномалии и несъответствия в системата. При открит проблем пише нов ред в zone_errors (ако вече няма неразрешен от същия тип), а при изчезване на проблема — попълва resolved_at. Пише единствено в zone_errors.</w:t>
       </w:r>
     </w:p>
@@ -2245,12 +2264,6 @@
         <w:gridCol w:w="5096"/>
       </w:tblGrid>
       <w:tr>
-        <w:tblPrEx>
-          <w:tblCellMar>
-            <w:top w:w="0" w:type="dxa"/>
-            <w:bottom w:w="0" w:type="dxa"/>
-          </w:tblCellMar>
-        </w:tblPrEx>
         <w:trPr>
           <w:tblHeader/>
         </w:trPr>
@@ -2328,12 +2341,6 @@
         </w:tc>
       </w:tr>
       <w:tr>
-        <w:tblPrEx>
-          <w:tblCellMar>
-            <w:top w:w="0" w:type="dxa"/>
-            <w:bottom w:w="0" w:type="dxa"/>
-          </w:tblCellMar>
-        </w:tblPrEx>
         <w:tc>
           <w:tcPr>
             <w:tcW w:w="2300" w:type="dxa"/>
@@ -2401,12 +2408,6 @@
         </w:tc>
       </w:tr>
       <w:tr>
-        <w:tblPrEx>
-          <w:tblCellMar>
-            <w:top w:w="0" w:type="dxa"/>
-            <w:bottom w:w="0" w:type="dxa"/>
-          </w:tblCellMar>
-        </w:tblPrEx>
         <w:tc>
           <w:tcPr>
             <w:tcW w:w="2300" w:type="dxa"/>
@@ -2474,12 +2475,6 @@
         </w:tc>
       </w:tr>
       <w:tr>
-        <w:tblPrEx>
-          <w:tblCellMar>
-            <w:top w:w="0" w:type="dxa"/>
-            <w:bottom w:w="0" w:type="dxa"/>
-          </w:tblCellMar>
-        </w:tblPrEx>
         <w:tc>
           <w:tcPr>
             <w:tcW w:w="2300" w:type="dxa"/>
@@ -2539,12 +2534,6 @@
         </w:tc>
       </w:tr>
       <w:tr>
-        <w:tblPrEx>
-          <w:tblCellMar>
-            <w:top w:w="0" w:type="dxa"/>
-            <w:bottom w:w="0" w:type="dxa"/>
-          </w:tblCellMar>
-        </w:tblPrEx>
         <w:tc>
           <w:tcPr>
             <w:tcW w:w="2300" w:type="dxa"/>
@@ -2563,6 +2552,7 @@
                 <w:sz w:val="19"/>
                 <w:szCs w:val="19"/>
               </w:rPr>
+              <w:lastRenderedPageBreak/>
               <w:t>regime</w:t>
             </w:r>
           </w:p>
@@ -2606,18 +2596,12 @@
                 <w:sz w:val="19"/>
                 <w:szCs w:val="19"/>
               </w:rPr>
-              <w:t>Ръчен / По часовник / По прагове.</w:t>
+              <w:t>Ръчен / По време / По прагове.</w:t>
             </w:r>
           </w:p>
         </w:tc>
       </w:tr>
       <w:tr>
-        <w:tblPrEx>
-          <w:tblCellMar>
-            <w:top w:w="0" w:type="dxa"/>
-            <w:bottom w:w="0" w:type="dxa"/>
-          </w:tblCellMar>
-        </w:tblPrEx>
         <w:tc>
           <w:tcPr>
             <w:tcW w:w="2300" w:type="dxa"/>
@@ -2685,12 +2669,6 @@
         </w:tc>
       </w:tr>
       <w:tr>
-        <w:tblPrEx>
-          <w:tblCellMar>
-            <w:top w:w="0" w:type="dxa"/>
-            <w:bottom w:w="0" w:type="dxa"/>
-          </w:tblCellMar>
-        </w:tblPrEx>
         <w:tc>
           <w:tcPr>
             <w:tcW w:w="2300" w:type="dxa"/>
@@ -2709,7 +2687,6 @@
                 <w:sz w:val="19"/>
                 <w:szCs w:val="19"/>
               </w:rPr>
-              <w:lastRenderedPageBreak/>
               <w:t>created_at</w:t>
             </w:r>
           </w:p>
@@ -2751,12 +2728,6 @@
         </w:tc>
       </w:tr>
       <w:tr>
-        <w:tblPrEx>
-          <w:tblCellMar>
-            <w:top w:w="0" w:type="dxa"/>
-            <w:bottom w:w="0" w:type="dxa"/>
-          </w:tblCellMar>
-        </w:tblPrEx>
         <w:tc>
           <w:tcPr>
             <w:tcW w:w="2300" w:type="dxa"/>
@@ -2824,12 +2795,6 @@
         </w:tc>
       </w:tr>
       <w:tr>
-        <w:tblPrEx>
-          <w:tblCellMar>
-            <w:top w:w="0" w:type="dxa"/>
-            <w:bottom w:w="0" w:type="dxa"/>
-          </w:tblCellMar>
-        </w:tblPrEx>
         <w:tc>
           <w:tcPr>
             <w:tcW w:w="2300" w:type="dxa"/>
@@ -2897,12 +2862,6 @@
         </w:tc>
       </w:tr>
       <w:tr>
-        <w:tblPrEx>
-          <w:tblCellMar>
-            <w:top w:w="0" w:type="dxa"/>
-            <w:bottom w:w="0" w:type="dxa"/>
-          </w:tblCellMar>
-        </w:tblPrEx>
         <w:tc>
           <w:tcPr>
             <w:tcW w:w="2300" w:type="dxa"/>
@@ -2970,12 +2929,6 @@
         </w:tc>
       </w:tr>
       <w:tr>
-        <w:tblPrEx>
-          <w:tblCellMar>
-            <w:top w:w="0" w:type="dxa"/>
-            <w:bottom w:w="0" w:type="dxa"/>
-          </w:tblCellMar>
-        </w:tblPrEx>
         <w:tc>
           <w:tcPr>
             <w:tcW w:w="2300" w:type="dxa"/>
@@ -3043,12 +2996,6 @@
         </w:tc>
       </w:tr>
       <w:tr>
-        <w:tblPrEx>
-          <w:tblCellMar>
-            <w:top w:w="0" w:type="dxa"/>
-            <w:bottom w:w="0" w:type="dxa"/>
-          </w:tblCellMar>
-        </w:tblPrEx>
         <w:tc>
           <w:tcPr>
             <w:tcW w:w="2300" w:type="dxa"/>
@@ -3110,7 +3057,7 @@
                 <w:sz w:val="19"/>
                 <w:szCs w:val="19"/>
               </w:rPr>
-              <w:t>Горна граница; служи и като преграда срещу преполиване преди отваряне на планиран клапан в режим „по часовник“.</w:t>
+              <w:t>Горна граница; служи и като преграда срещу преполиване преди отваряне на планиран клапан в режим „по време“.</w:t>
             </w:r>
           </w:p>
         </w:tc>
@@ -3184,12 +3131,6 @@
         <w:gridCol w:w="5096"/>
       </w:tblGrid>
       <w:tr>
-        <w:tblPrEx>
-          <w:tblCellMar>
-            <w:top w:w="0" w:type="dxa"/>
-            <w:bottom w:w="0" w:type="dxa"/>
-          </w:tblCellMar>
-        </w:tblPrEx>
         <w:trPr>
           <w:tblHeader/>
         </w:trPr>
@@ -3267,12 +3208,6 @@
         </w:tc>
       </w:tr>
       <w:tr>
-        <w:tblPrEx>
-          <w:tblCellMar>
-            <w:top w:w="0" w:type="dxa"/>
-            <w:bottom w:w="0" w:type="dxa"/>
-          </w:tblCellMar>
-        </w:tblPrEx>
         <w:tc>
           <w:tcPr>
             <w:tcW w:w="2300" w:type="dxa"/>
@@ -3340,12 +3275,6 @@
         </w:tc>
       </w:tr>
       <w:tr>
-        <w:tblPrEx>
-          <w:tblCellMar>
-            <w:top w:w="0" w:type="dxa"/>
-            <w:bottom w:w="0" w:type="dxa"/>
-          </w:tblCellMar>
-        </w:tblPrEx>
         <w:tc>
           <w:tcPr>
             <w:tcW w:w="2300" w:type="dxa"/>
@@ -3405,12 +3334,6 @@
         </w:tc>
       </w:tr>
       <w:tr>
-        <w:tblPrEx>
-          <w:tblCellMar>
-            <w:top w:w="0" w:type="dxa"/>
-            <w:bottom w:w="0" w:type="dxa"/>
-          </w:tblCellMar>
-        </w:tblPrEx>
         <w:tc>
           <w:tcPr>
             <w:tcW w:w="2300" w:type="dxa"/>
@@ -3470,12 +3393,6 @@
         </w:tc>
       </w:tr>
       <w:tr>
-        <w:tblPrEx>
-          <w:tblCellMar>
-            <w:top w:w="0" w:type="dxa"/>
-            <w:bottom w:w="0" w:type="dxa"/>
-          </w:tblCellMar>
-        </w:tblPrEx>
         <w:tc>
           <w:tcPr>
             <w:tcW w:w="2300" w:type="dxa"/>
@@ -3583,12 +3500,6 @@
         <w:gridCol w:w="5096"/>
       </w:tblGrid>
       <w:tr>
-        <w:tblPrEx>
-          <w:tblCellMar>
-            <w:top w:w="0" w:type="dxa"/>
-            <w:bottom w:w="0" w:type="dxa"/>
-          </w:tblCellMar>
-        </w:tblPrEx>
         <w:trPr>
           <w:tblHeader/>
         </w:trPr>
@@ -3666,12 +3577,6 @@
         </w:tc>
       </w:tr>
       <w:tr>
-        <w:tblPrEx>
-          <w:tblCellMar>
-            <w:top w:w="0" w:type="dxa"/>
-            <w:bottom w:w="0" w:type="dxa"/>
-          </w:tblCellMar>
-        </w:tblPrEx>
         <w:tc>
           <w:tcPr>
             <w:tcW w:w="2300" w:type="dxa"/>
@@ -3739,12 +3644,6 @@
         </w:tc>
       </w:tr>
       <w:tr>
-        <w:tblPrEx>
-          <w:tblCellMar>
-            <w:top w:w="0" w:type="dxa"/>
-            <w:bottom w:w="0" w:type="dxa"/>
-          </w:tblCellMar>
-        </w:tblPrEx>
         <w:tc>
           <w:tcPr>
             <w:tcW w:w="2300" w:type="dxa"/>
@@ -3804,12 +3703,6 @@
         </w:tc>
       </w:tr>
       <w:tr>
-        <w:tblPrEx>
-          <w:tblCellMar>
-            <w:top w:w="0" w:type="dxa"/>
-            <w:bottom w:w="0" w:type="dxa"/>
-          </w:tblCellMar>
-        </w:tblPrEx>
         <w:tc>
           <w:tcPr>
             <w:tcW w:w="2300" w:type="dxa"/>
@@ -3869,12 +3762,6 @@
         </w:tc>
       </w:tr>
       <w:tr>
-        <w:tblPrEx>
-          <w:tblCellMar>
-            <w:top w:w="0" w:type="dxa"/>
-            <w:bottom w:w="0" w:type="dxa"/>
-          </w:tblCellMar>
-        </w:tblPrEx>
         <w:tc>
           <w:tcPr>
             <w:tcW w:w="2300" w:type="dxa"/>
@@ -3934,12 +3821,6 @@
         </w:tc>
       </w:tr>
       <w:tr>
-        <w:tblPrEx>
-          <w:tblCellMar>
-            <w:top w:w="0" w:type="dxa"/>
-            <w:bottom w:w="0" w:type="dxa"/>
-          </w:tblCellMar>
-        </w:tblPrEx>
         <w:tc>
           <w:tcPr>
             <w:tcW w:w="2300" w:type="dxa"/>
@@ -3999,12 +3880,6 @@
         </w:tc>
       </w:tr>
       <w:tr>
-        <w:tblPrEx>
-          <w:tblCellMar>
-            <w:top w:w="0" w:type="dxa"/>
-            <w:bottom w:w="0" w:type="dxa"/>
-          </w:tblCellMar>
-        </w:tblPrEx>
         <w:tc>
           <w:tcPr>
             <w:tcW w:w="2300" w:type="dxa"/>
@@ -4112,12 +3987,6 @@
         <w:gridCol w:w="5096"/>
       </w:tblGrid>
       <w:tr>
-        <w:tblPrEx>
-          <w:tblCellMar>
-            <w:top w:w="0" w:type="dxa"/>
-            <w:bottom w:w="0" w:type="dxa"/>
-          </w:tblCellMar>
-        </w:tblPrEx>
         <w:trPr>
           <w:tblHeader/>
         </w:trPr>
@@ -4195,12 +4064,6 @@
         </w:tc>
       </w:tr>
       <w:tr>
-        <w:tblPrEx>
-          <w:tblCellMar>
-            <w:top w:w="0" w:type="dxa"/>
-            <w:bottom w:w="0" w:type="dxa"/>
-          </w:tblCellMar>
-        </w:tblPrEx>
         <w:tc>
           <w:tcPr>
             <w:tcW w:w="2300" w:type="dxa"/>
@@ -4268,12 +4131,6 @@
         </w:tc>
       </w:tr>
       <w:tr>
-        <w:tblPrEx>
-          <w:tblCellMar>
-            <w:top w:w="0" w:type="dxa"/>
-            <w:bottom w:w="0" w:type="dxa"/>
-          </w:tblCellMar>
-        </w:tblPrEx>
         <w:tc>
           <w:tcPr>
             <w:tcW w:w="2300" w:type="dxa"/>
@@ -4333,12 +4190,6 @@
         </w:tc>
       </w:tr>
       <w:tr>
-        <w:tblPrEx>
-          <w:tblCellMar>
-            <w:top w:w="0" w:type="dxa"/>
-            <w:bottom w:w="0" w:type="dxa"/>
-          </w:tblCellMar>
-        </w:tblPrEx>
         <w:tc>
           <w:tcPr>
             <w:tcW w:w="2300" w:type="dxa"/>
@@ -4398,12 +4249,6 @@
         </w:tc>
       </w:tr>
       <w:tr>
-        <w:tblPrEx>
-          <w:tblCellMar>
-            <w:top w:w="0" w:type="dxa"/>
-            <w:bottom w:w="0" w:type="dxa"/>
-          </w:tblCellMar>
-        </w:tblPrEx>
         <w:tc>
           <w:tcPr>
             <w:tcW w:w="2300" w:type="dxa"/>
@@ -4422,6 +4267,7 @@
                 <w:sz w:val="19"/>
                 <w:szCs w:val="19"/>
               </w:rPr>
+              <w:lastRenderedPageBreak/>
               <w:t>last_heartbeat_at</w:t>
             </w:r>
           </w:p>
@@ -4485,7 +4331,6 @@
           <w:sz w:val="22"/>
           <w:szCs w:val="22"/>
         </w:rPr>
-        <w:lastRenderedPageBreak/>
         <w:t>SENSORS</w:t>
       </w:r>
     </w:p>
@@ -4512,12 +4357,6 @@
         <w:gridCol w:w="5096"/>
       </w:tblGrid>
       <w:tr>
-        <w:tblPrEx>
-          <w:tblCellMar>
-            <w:top w:w="0" w:type="dxa"/>
-            <w:bottom w:w="0" w:type="dxa"/>
-          </w:tblCellMar>
-        </w:tblPrEx>
         <w:trPr>
           <w:tblHeader/>
         </w:trPr>
@@ -4595,12 +4434,6 @@
         </w:tc>
       </w:tr>
       <w:tr>
-        <w:tblPrEx>
-          <w:tblCellMar>
-            <w:top w:w="0" w:type="dxa"/>
-            <w:bottom w:w="0" w:type="dxa"/>
-          </w:tblCellMar>
-        </w:tblPrEx>
         <w:tc>
           <w:tcPr>
             <w:tcW w:w="2300" w:type="dxa"/>
@@ -4668,12 +4501,6 @@
         </w:tc>
       </w:tr>
       <w:tr>
-        <w:tblPrEx>
-          <w:tblCellMar>
-            <w:top w:w="0" w:type="dxa"/>
-            <w:bottom w:w="0" w:type="dxa"/>
-          </w:tblCellMar>
-        </w:tblPrEx>
         <w:tc>
           <w:tcPr>
             <w:tcW w:w="2300" w:type="dxa"/>
@@ -4733,12 +4560,6 @@
         </w:tc>
       </w:tr>
       <w:tr>
-        <w:tblPrEx>
-          <w:tblCellMar>
-            <w:top w:w="0" w:type="dxa"/>
-            <w:bottom w:w="0" w:type="dxa"/>
-          </w:tblCellMar>
-        </w:tblPrEx>
         <w:tc>
           <w:tcPr>
             <w:tcW w:w="2300" w:type="dxa"/>
@@ -4806,12 +4627,6 @@
         </w:tc>
       </w:tr>
       <w:tr>
-        <w:tblPrEx>
-          <w:tblCellMar>
-            <w:top w:w="0" w:type="dxa"/>
-            <w:bottom w:w="0" w:type="dxa"/>
-          </w:tblCellMar>
-        </w:tblPrEx>
         <w:tc>
           <w:tcPr>
             <w:tcW w:w="2300" w:type="dxa"/>
@@ -4919,12 +4734,6 @@
         <w:gridCol w:w="5096"/>
       </w:tblGrid>
       <w:tr>
-        <w:tblPrEx>
-          <w:tblCellMar>
-            <w:top w:w="0" w:type="dxa"/>
-            <w:bottom w:w="0" w:type="dxa"/>
-          </w:tblCellMar>
-        </w:tblPrEx>
         <w:trPr>
           <w:tblHeader/>
         </w:trPr>
@@ -5002,12 +4811,6 @@
         </w:tc>
       </w:tr>
       <w:tr>
-        <w:tblPrEx>
-          <w:tblCellMar>
-            <w:top w:w="0" w:type="dxa"/>
-            <w:bottom w:w="0" w:type="dxa"/>
-          </w:tblCellMar>
-        </w:tblPrEx>
         <w:tc>
           <w:tcPr>
             <w:tcW w:w="2300" w:type="dxa"/>
@@ -5067,12 +4870,6 @@
         </w:tc>
       </w:tr>
       <w:tr>
-        <w:tblPrEx>
-          <w:tblCellMar>
-            <w:top w:w="0" w:type="dxa"/>
-            <w:bottom w:w="0" w:type="dxa"/>
-          </w:tblCellMar>
-        </w:tblPrEx>
         <w:tc>
           <w:tcPr>
             <w:tcW w:w="2300" w:type="dxa"/>
@@ -5180,12 +4977,6 @@
         <w:gridCol w:w="4848"/>
       </w:tblGrid>
       <w:tr>
-        <w:tblPrEx>
-          <w:tblCellMar>
-            <w:top w:w="0" w:type="dxa"/>
-            <w:bottom w:w="0" w:type="dxa"/>
-          </w:tblCellMar>
-        </w:tblPrEx>
         <w:trPr>
           <w:tblHeader/>
         </w:trPr>
@@ -5263,12 +5054,6 @@
         </w:tc>
       </w:tr>
       <w:tr>
-        <w:tblPrEx>
-          <w:tblCellMar>
-            <w:top w:w="0" w:type="dxa"/>
-            <w:bottom w:w="0" w:type="dxa"/>
-          </w:tblCellMar>
-        </w:tblPrEx>
         <w:tc>
           <w:tcPr>
             <w:tcW w:w="2300" w:type="dxa"/>
@@ -5336,12 +5121,6 @@
         </w:tc>
       </w:tr>
       <w:tr>
-        <w:tblPrEx>
-          <w:tblCellMar>
-            <w:top w:w="0" w:type="dxa"/>
-            <w:bottom w:w="0" w:type="dxa"/>
-          </w:tblCellMar>
-        </w:tblPrEx>
         <w:tc>
           <w:tcPr>
             <w:tcW w:w="2300" w:type="dxa"/>
@@ -5401,12 +5180,6 @@
         </w:tc>
       </w:tr>
       <w:tr>
-        <w:tblPrEx>
-          <w:tblCellMar>
-            <w:top w:w="0" w:type="dxa"/>
-            <w:bottom w:w="0" w:type="dxa"/>
-          </w:tblCellMar>
-        </w:tblPrEx>
         <w:tc>
           <w:tcPr>
             <w:tcW w:w="2300" w:type="dxa"/>
@@ -5474,12 +5247,6 @@
         </w:tc>
       </w:tr>
       <w:tr>
-        <w:tblPrEx>
-          <w:tblCellMar>
-            <w:top w:w="0" w:type="dxa"/>
-            <w:bottom w:w="0" w:type="dxa"/>
-          </w:tblCellMar>
-        </w:tblPrEx>
         <w:tc>
           <w:tcPr>
             <w:tcW w:w="2300" w:type="dxa"/>
@@ -5547,12 +5314,6 @@
         </w:tc>
       </w:tr>
       <w:tr>
-        <w:tblPrEx>
-          <w:tblCellMar>
-            <w:top w:w="0" w:type="dxa"/>
-            <w:bottom w:w="0" w:type="dxa"/>
-          </w:tblCellMar>
-        </w:tblPrEx>
         <w:tc>
           <w:tcPr>
             <w:tcW w:w="2300" w:type="dxa"/>
@@ -5620,12 +5381,6 @@
         </w:tc>
       </w:tr>
       <w:tr>
-        <w:tblPrEx>
-          <w:tblCellMar>
-            <w:top w:w="0" w:type="dxa"/>
-            <w:bottom w:w="0" w:type="dxa"/>
-          </w:tblCellMar>
-        </w:tblPrEx>
         <w:tc>
           <w:tcPr>
             <w:tcW w:w="2300" w:type="dxa"/>
@@ -5693,12 +5448,6 @@
         </w:tc>
       </w:tr>
       <w:tr>
-        <w:tblPrEx>
-          <w:tblCellMar>
-            <w:top w:w="0" w:type="dxa"/>
-            <w:bottom w:w="0" w:type="dxa"/>
-          </w:tblCellMar>
-        </w:tblPrEx>
         <w:tc>
           <w:tcPr>
             <w:tcW w:w="2300" w:type="dxa"/>
@@ -5766,12 +5515,6 @@
         </w:tc>
       </w:tr>
       <w:tr>
-        <w:tblPrEx>
-          <w:tblCellMar>
-            <w:top w:w="0" w:type="dxa"/>
-            <w:bottom w:w="0" w:type="dxa"/>
-          </w:tblCellMar>
-        </w:tblPrEx>
         <w:tc>
           <w:tcPr>
             <w:tcW w:w="2300" w:type="dxa"/>
@@ -5831,12 +5574,6 @@
         </w:tc>
       </w:tr>
       <w:tr>
-        <w:tblPrEx>
-          <w:tblCellMar>
-            <w:top w:w="0" w:type="dxa"/>
-            <w:bottom w:w="0" w:type="dxa"/>
-          </w:tblCellMar>
-        </w:tblPrEx>
         <w:tc>
           <w:tcPr>
             <w:tcW w:w="2300" w:type="dxa"/>
@@ -5896,12 +5633,6 @@
         </w:tc>
       </w:tr>
       <w:tr>
-        <w:tblPrEx>
-          <w:tblCellMar>
-            <w:top w:w="0" w:type="dxa"/>
-            <w:bottom w:w="0" w:type="dxa"/>
-          </w:tblCellMar>
-        </w:tblPrEx>
         <w:tc>
           <w:tcPr>
             <w:tcW w:w="2300" w:type="dxa"/>
@@ -5961,12 +5692,6 @@
         </w:tc>
       </w:tr>
       <w:tr>
-        <w:tblPrEx>
-          <w:tblCellMar>
-            <w:top w:w="0" w:type="dxa"/>
-            <w:bottom w:w="0" w:type="dxa"/>
-          </w:tblCellMar>
-        </w:tblPrEx>
         <w:tc>
           <w:tcPr>
             <w:tcW w:w="2300" w:type="dxa"/>
@@ -6034,12 +5759,6 @@
         </w:tc>
       </w:tr>
       <w:tr>
-        <w:tblPrEx>
-          <w:tblCellMar>
-            <w:top w:w="0" w:type="dxa"/>
-            <w:bottom w:w="0" w:type="dxa"/>
-          </w:tblCellMar>
-        </w:tblPrEx>
         <w:tc>
           <w:tcPr>
             <w:tcW w:w="2300" w:type="dxa"/>
@@ -6107,12 +5826,6 @@
         </w:tc>
       </w:tr>
       <w:tr>
-        <w:tblPrEx>
-          <w:tblCellMar>
-            <w:top w:w="0" w:type="dxa"/>
-            <w:bottom w:w="0" w:type="dxa"/>
-          </w:tblCellMar>
-        </w:tblPrEx>
         <w:tc>
           <w:tcPr>
             <w:tcW w:w="2300" w:type="dxa"/>
@@ -6228,12 +5941,6 @@
         <w:gridCol w:w="5096"/>
       </w:tblGrid>
       <w:tr>
-        <w:tblPrEx>
-          <w:tblCellMar>
-            <w:top w:w="0" w:type="dxa"/>
-            <w:bottom w:w="0" w:type="dxa"/>
-          </w:tblCellMar>
-        </w:tblPrEx>
         <w:trPr>
           <w:tblHeader/>
         </w:trPr>
@@ -6257,7 +5964,6 @@
                 <w:sz w:val="19"/>
                 <w:szCs w:val="19"/>
               </w:rPr>
-              <w:lastRenderedPageBreak/>
               <w:t>Поле</w:t>
             </w:r>
           </w:p>
@@ -6312,12 +6018,6 @@
         </w:tc>
       </w:tr>
       <w:tr>
-        <w:tblPrEx>
-          <w:tblCellMar>
-            <w:top w:w="0" w:type="dxa"/>
-            <w:bottom w:w="0" w:type="dxa"/>
-          </w:tblCellMar>
-        </w:tblPrEx>
         <w:tc>
           <w:tcPr>
             <w:tcW w:w="2300" w:type="dxa"/>
@@ -6385,12 +6085,6 @@
         </w:tc>
       </w:tr>
       <w:tr>
-        <w:tblPrEx>
-          <w:tblCellMar>
-            <w:top w:w="0" w:type="dxa"/>
-            <w:bottom w:w="0" w:type="dxa"/>
-          </w:tblCellMar>
-        </w:tblPrEx>
         <w:tc>
           <w:tcPr>
             <w:tcW w:w="2300" w:type="dxa"/>
@@ -6458,12 +6152,6 @@
         </w:tc>
       </w:tr>
       <w:tr>
-        <w:tblPrEx>
-          <w:tblCellMar>
-            <w:top w:w="0" w:type="dxa"/>
-            <w:bottom w:w="0" w:type="dxa"/>
-          </w:tblCellMar>
-        </w:tblPrEx>
         <w:tc>
           <w:tcPr>
             <w:tcW w:w="2300" w:type="dxa"/>
@@ -6531,12 +6219,6 @@
         </w:tc>
       </w:tr>
       <w:tr>
-        <w:tblPrEx>
-          <w:tblCellMar>
-            <w:top w:w="0" w:type="dxa"/>
-            <w:bottom w:w="0" w:type="dxa"/>
-          </w:tblCellMar>
-        </w:tblPrEx>
         <w:tc>
           <w:tcPr>
             <w:tcW w:w="2300" w:type="dxa"/>
@@ -6596,12 +6278,6 @@
         </w:tc>
       </w:tr>
       <w:tr>
-        <w:tblPrEx>
-          <w:tblCellMar>
-            <w:top w:w="0" w:type="dxa"/>
-            <w:bottom w:w="0" w:type="dxa"/>
-          </w:tblCellMar>
-        </w:tblPrEx>
         <w:tc>
           <w:tcPr>
             <w:tcW w:w="2300" w:type="dxa"/>
@@ -6661,12 +6337,6 @@
         </w:tc>
       </w:tr>
       <w:tr>
-        <w:tblPrEx>
-          <w:tblCellMar>
-            <w:top w:w="0" w:type="dxa"/>
-            <w:bottom w:w="0" w:type="dxa"/>
-          </w:tblCellMar>
-        </w:tblPrEx>
         <w:tc>
           <w:tcPr>
             <w:tcW w:w="2300" w:type="dxa"/>
@@ -6726,12 +6396,6 @@
         </w:tc>
       </w:tr>
       <w:tr>
-        <w:tblPrEx>
-          <w:tblCellMar>
-            <w:top w:w="0" w:type="dxa"/>
-            <w:bottom w:w="0" w:type="dxa"/>
-          </w:tblCellMar>
-        </w:tblPrEx>
         <w:tc>
           <w:tcPr>
             <w:tcW w:w="2300" w:type="dxa"/>
@@ -6791,12 +6455,6 @@
         </w:tc>
       </w:tr>
       <w:tr>
-        <w:tblPrEx>
-          <w:tblCellMar>
-            <w:top w:w="0" w:type="dxa"/>
-            <w:bottom w:w="0" w:type="dxa"/>
-          </w:tblCellMar>
-        </w:tblPrEx>
         <w:tc>
           <w:tcPr>
             <w:tcW w:w="2300" w:type="dxa"/>
@@ -6856,12 +6514,6 @@
         </w:tc>
       </w:tr>
       <w:tr>
-        <w:tblPrEx>
-          <w:tblCellMar>
-            <w:top w:w="0" w:type="dxa"/>
-            <w:bottom w:w="0" w:type="dxa"/>
-          </w:tblCellMar>
-        </w:tblPrEx>
         <w:tc>
           <w:tcPr>
             <w:tcW w:w="2300" w:type="dxa"/>
@@ -6921,12 +6573,6 @@
         </w:tc>
       </w:tr>
       <w:tr>
-        <w:tblPrEx>
-          <w:tblCellMar>
-            <w:top w:w="0" w:type="dxa"/>
-            <w:bottom w:w="0" w:type="dxa"/>
-          </w:tblCellMar>
-        </w:tblPrEx>
         <w:tc>
           <w:tcPr>
             <w:tcW w:w="2300" w:type="dxa"/>
@@ -6994,12 +6640,6 @@
         </w:tc>
       </w:tr>
       <w:tr>
-        <w:tblPrEx>
-          <w:tblCellMar>
-            <w:top w:w="0" w:type="dxa"/>
-            <w:bottom w:w="0" w:type="dxa"/>
-          </w:tblCellMar>
-        </w:tblPrEx>
         <w:tc>
           <w:tcPr>
             <w:tcW w:w="2300" w:type="dxa"/>
@@ -7067,12 +6707,6 @@
         </w:tc>
       </w:tr>
       <w:tr>
-        <w:tblPrEx>
-          <w:tblCellMar>
-            <w:top w:w="0" w:type="dxa"/>
-            <w:bottom w:w="0" w:type="dxa"/>
-          </w:tblCellMar>
-        </w:tblPrEx>
         <w:tc>
           <w:tcPr>
             <w:tcW w:w="2300" w:type="dxa"/>
@@ -7134,18 +6768,12 @@
                 <w:sz w:val="19"/>
                 <w:szCs w:val="19"/>
               </w:rPr>
-              <w:t>В режим „по часовник“ — ръчна команда временно измества графика за текущия интервал; графикът си взема управлението обратно щом интервалът приключи/започне.</w:t>
+              <w:t>В режим „по време“ — ръчна команда временно измества графика за текущия интервал; графикът си взема управлението обратно щом интервалът приключи/започне.</w:t>
             </w:r>
           </w:p>
         </w:tc>
       </w:tr>
       <w:tr>
-        <w:tblPrEx>
-          <w:tblCellMar>
-            <w:top w:w="0" w:type="dxa"/>
-            <w:bottom w:w="0" w:type="dxa"/>
-          </w:tblCellMar>
-        </w:tblPrEx>
         <w:tc>
           <w:tcPr>
             <w:tcW w:w="2300" w:type="dxa"/>
@@ -7213,12 +6841,6 @@
         </w:tc>
       </w:tr>
       <w:tr>
-        <w:tblPrEx>
-          <w:tblCellMar>
-            <w:top w:w="0" w:type="dxa"/>
-            <w:bottom w:w="0" w:type="dxa"/>
-          </w:tblCellMar>
-        </w:tblPrEx>
         <w:tc>
           <w:tcPr>
             <w:tcW w:w="2300" w:type="dxa"/>
@@ -7354,12 +6976,6 @@
         <w:gridCol w:w="5096"/>
       </w:tblGrid>
       <w:tr>
-        <w:tblPrEx>
-          <w:tblCellMar>
-            <w:top w:w="0" w:type="dxa"/>
-            <w:bottom w:w="0" w:type="dxa"/>
-          </w:tblCellMar>
-        </w:tblPrEx>
         <w:trPr>
           <w:tblHeader/>
         </w:trPr>
@@ -7437,12 +7053,6 @@
         </w:tc>
       </w:tr>
       <w:tr>
-        <w:tblPrEx>
-          <w:tblCellMar>
-            <w:top w:w="0" w:type="dxa"/>
-            <w:bottom w:w="0" w:type="dxa"/>
-          </w:tblCellMar>
-        </w:tblPrEx>
         <w:tc>
           <w:tcPr>
             <w:tcW w:w="2300" w:type="dxa"/>
@@ -7502,12 +7112,6 @@
         </w:tc>
       </w:tr>
       <w:tr>
-        <w:tblPrEx>
-          <w:tblCellMar>
-            <w:top w:w="0" w:type="dxa"/>
-            <w:bottom w:w="0" w:type="dxa"/>
-          </w:tblCellMar>
-        </w:tblPrEx>
         <w:tc>
           <w:tcPr>
             <w:tcW w:w="2300" w:type="dxa"/>
@@ -7567,12 +7171,6 @@
         </w:tc>
       </w:tr>
       <w:tr>
-        <w:tblPrEx>
-          <w:tblCellMar>
-            <w:top w:w="0" w:type="dxa"/>
-            <w:bottom w:w="0" w:type="dxa"/>
-          </w:tblCellMar>
-        </w:tblPrEx>
         <w:tc>
           <w:tcPr>
             <w:tcW w:w="2300" w:type="dxa"/>
@@ -7640,12 +7238,6 @@
         </w:tc>
       </w:tr>
       <w:tr>
-        <w:tblPrEx>
-          <w:tblCellMar>
-            <w:top w:w="0" w:type="dxa"/>
-            <w:bottom w:w="0" w:type="dxa"/>
-          </w:tblCellMar>
-        </w:tblPrEx>
         <w:tc>
           <w:tcPr>
             <w:tcW w:w="2300" w:type="dxa"/>
@@ -7713,12 +7305,6 @@
         </w:tc>
       </w:tr>
       <w:tr>
-        <w:tblPrEx>
-          <w:tblCellMar>
-            <w:top w:w="0" w:type="dxa"/>
-            <w:bottom w:w="0" w:type="dxa"/>
-          </w:tblCellMar>
-        </w:tblPrEx>
         <w:tc>
           <w:tcPr>
             <w:tcW w:w="2300" w:type="dxa"/>
@@ -7786,12 +7372,6 @@
         </w:tc>
       </w:tr>
       <w:tr>
-        <w:tblPrEx>
-          <w:tblCellMar>
-            <w:top w:w="0" w:type="dxa"/>
-            <w:bottom w:w="0" w:type="dxa"/>
-          </w:tblCellMar>
-        </w:tblPrEx>
         <w:tc>
           <w:tcPr>
             <w:tcW w:w="2300" w:type="dxa"/>
@@ -7859,12 +7439,6 @@
         </w:tc>
       </w:tr>
       <w:tr>
-        <w:tblPrEx>
-          <w:tblCellMar>
-            <w:top w:w="0" w:type="dxa"/>
-            <w:bottom w:w="0" w:type="dxa"/>
-          </w:tblCellMar>
-        </w:tblPrEx>
         <w:tc>
           <w:tcPr>
             <w:tcW w:w="2300" w:type="dxa"/>
@@ -7966,6 +7540,7 @@
           <w:sz w:val="22"/>
           <w:szCs w:val="22"/>
         </w:rPr>
+        <w:lastRenderedPageBreak/>
         <w:t>ZONE_SCHEDULES</w:t>
       </w:r>
     </w:p>
@@ -7992,12 +7567,6 @@
         <w:gridCol w:w="5096"/>
       </w:tblGrid>
       <w:tr>
-        <w:tblPrEx>
-          <w:tblCellMar>
-            <w:top w:w="0" w:type="dxa"/>
-            <w:bottom w:w="0" w:type="dxa"/>
-          </w:tblCellMar>
-        </w:tblPrEx>
         <w:trPr>
           <w:tblHeader/>
         </w:trPr>
@@ -8021,7 +7590,6 @@
                 <w:sz w:val="19"/>
                 <w:szCs w:val="19"/>
               </w:rPr>
-              <w:lastRenderedPageBreak/>
               <w:t>Поле</w:t>
             </w:r>
           </w:p>
@@ -8076,12 +7644,6 @@
         </w:tc>
       </w:tr>
       <w:tr>
-        <w:tblPrEx>
-          <w:tblCellMar>
-            <w:top w:w="0" w:type="dxa"/>
-            <w:bottom w:w="0" w:type="dxa"/>
-          </w:tblCellMar>
-        </w:tblPrEx>
         <w:tc>
           <w:tcPr>
             <w:tcW w:w="2300" w:type="dxa"/>
@@ -8141,12 +7703,6 @@
         </w:tc>
       </w:tr>
       <w:tr>
-        <w:tblPrEx>
-          <w:tblCellMar>
-            <w:top w:w="0" w:type="dxa"/>
-            <w:bottom w:w="0" w:type="dxa"/>
-          </w:tblCellMar>
-        </w:tblPrEx>
         <w:tc>
           <w:tcPr>
             <w:tcW w:w="2300" w:type="dxa"/>
@@ -8206,12 +7762,6 @@
         </w:tc>
       </w:tr>
       <w:tr>
-        <w:tblPrEx>
-          <w:tblCellMar>
-            <w:top w:w="0" w:type="dxa"/>
-            <w:bottom w:w="0" w:type="dxa"/>
-          </w:tblCellMar>
-        </w:tblPrEx>
         <w:tc>
           <w:tcPr>
             <w:tcW w:w="2300" w:type="dxa"/>
@@ -8279,12 +7829,6 @@
         </w:tc>
       </w:tr>
       <w:tr>
-        <w:tblPrEx>
-          <w:tblCellMar>
-            <w:top w:w="0" w:type="dxa"/>
-            <w:bottom w:w="0" w:type="dxa"/>
-          </w:tblCellMar>
-        </w:tblPrEx>
         <w:tc>
           <w:tcPr>
             <w:tcW w:w="2300" w:type="dxa"/>
@@ -8352,12 +7896,6 @@
         </w:tc>
       </w:tr>
       <w:tr>
-        <w:tblPrEx>
-          <w:tblCellMar>
-            <w:top w:w="0" w:type="dxa"/>
-            <w:bottom w:w="0" w:type="dxa"/>
-          </w:tblCellMar>
-        </w:tblPrEx>
         <w:tc>
           <w:tcPr>
             <w:tcW w:w="2300" w:type="dxa"/>
@@ -8425,12 +7963,6 @@
         </w:tc>
       </w:tr>
       <w:tr>
-        <w:tblPrEx>
-          <w:tblCellMar>
-            <w:top w:w="0" w:type="dxa"/>
-            <w:bottom w:w="0" w:type="dxa"/>
-          </w:tblCellMar>
-        </w:tblPrEx>
         <w:tc>
           <w:tcPr>
             <w:tcW w:w="2300" w:type="dxa"/>
@@ -8538,12 +8070,6 @@
         <w:gridCol w:w="5096"/>
       </w:tblGrid>
       <w:tr>
-        <w:tblPrEx>
-          <w:tblCellMar>
-            <w:top w:w="0" w:type="dxa"/>
-            <w:bottom w:w="0" w:type="dxa"/>
-          </w:tblCellMar>
-        </w:tblPrEx>
         <w:trPr>
           <w:tblHeader/>
         </w:trPr>
@@ -8621,12 +8147,6 @@
         </w:tc>
       </w:tr>
       <w:tr>
-        <w:tblPrEx>
-          <w:tblCellMar>
-            <w:top w:w="0" w:type="dxa"/>
-            <w:bottom w:w="0" w:type="dxa"/>
-          </w:tblCellMar>
-        </w:tblPrEx>
         <w:tc>
           <w:tcPr>
             <w:tcW w:w="2300" w:type="dxa"/>
@@ -8686,12 +8206,6 @@
         </w:tc>
       </w:tr>
       <w:tr>
-        <w:tblPrEx>
-          <w:tblCellMar>
-            <w:top w:w="0" w:type="dxa"/>
-            <w:bottom w:w="0" w:type="dxa"/>
-          </w:tblCellMar>
-        </w:tblPrEx>
         <w:tc>
           <w:tcPr>
             <w:tcW w:w="2300" w:type="dxa"/>
@@ -8799,12 +8313,6 @@
         <w:gridCol w:w="5012"/>
       </w:tblGrid>
       <w:tr>
-        <w:tblPrEx>
-          <w:tblCellMar>
-            <w:top w:w="0" w:type="dxa"/>
-            <w:bottom w:w="0" w:type="dxa"/>
-          </w:tblCellMar>
-        </w:tblPrEx>
         <w:trPr>
           <w:tblHeader/>
         </w:trPr>
@@ -8882,12 +8390,6 @@
         </w:tc>
       </w:tr>
       <w:tr>
-        <w:tblPrEx>
-          <w:tblCellMar>
-            <w:top w:w="0" w:type="dxa"/>
-            <w:bottom w:w="0" w:type="dxa"/>
-          </w:tblCellMar>
-        </w:tblPrEx>
         <w:tc>
           <w:tcPr>
             <w:tcW w:w="2300" w:type="dxa"/>
@@ -8947,12 +8449,6 @@
         </w:tc>
       </w:tr>
       <w:tr>
-        <w:tblPrEx>
-          <w:tblCellMar>
-            <w:top w:w="0" w:type="dxa"/>
-            <w:bottom w:w="0" w:type="dxa"/>
-          </w:tblCellMar>
-        </w:tblPrEx>
         <w:tc>
           <w:tcPr>
             <w:tcW w:w="2300" w:type="dxa"/>
@@ -9020,12 +8516,6 @@
         </w:tc>
       </w:tr>
       <w:tr>
-        <w:tblPrEx>
-          <w:tblCellMar>
-            <w:top w:w="0" w:type="dxa"/>
-            <w:bottom w:w="0" w:type="dxa"/>
-          </w:tblCellMar>
-        </w:tblPrEx>
         <w:tc>
           <w:tcPr>
             <w:tcW w:w="2300" w:type="dxa"/>
@@ -9085,12 +8575,6 @@
         </w:tc>
       </w:tr>
       <w:tr>
-        <w:tblPrEx>
-          <w:tblCellMar>
-            <w:top w:w="0" w:type="dxa"/>
-            <w:bottom w:w="0" w:type="dxa"/>
-          </w:tblCellMar>
-        </w:tblPrEx>
         <w:tc>
           <w:tcPr>
             <w:tcW w:w="2300" w:type="dxa"/>
@@ -9150,12 +8634,6 @@
         </w:tc>
       </w:tr>
       <w:tr>
-        <w:tblPrEx>
-          <w:tblCellMar>
-            <w:top w:w="0" w:type="dxa"/>
-            <w:bottom w:w="0" w:type="dxa"/>
-          </w:tblCellMar>
-        </w:tblPrEx>
         <w:tc>
           <w:tcPr>
             <w:tcW w:w="2300" w:type="dxa"/>
@@ -9223,12 +8701,6 @@
         </w:tc>
       </w:tr>
       <w:tr>
-        <w:tblPrEx>
-          <w:tblCellMar>
-            <w:top w:w="0" w:type="dxa"/>
-            <w:bottom w:w="0" w:type="dxa"/>
-          </w:tblCellMar>
-        </w:tblPrEx>
         <w:tc>
           <w:tcPr>
             <w:tcW w:w="2300" w:type="dxa"/>
@@ -9344,12 +8816,6 @@
         <w:gridCol w:w="5096"/>
       </w:tblGrid>
       <w:tr>
-        <w:tblPrEx>
-          <w:tblCellMar>
-            <w:top w:w="0" w:type="dxa"/>
-            <w:bottom w:w="0" w:type="dxa"/>
-          </w:tblCellMar>
-        </w:tblPrEx>
         <w:trPr>
           <w:tblHeader/>
         </w:trPr>
@@ -9427,12 +8893,6 @@
         </w:tc>
       </w:tr>
       <w:tr>
-        <w:tblPrEx>
-          <w:tblCellMar>
-            <w:top w:w="0" w:type="dxa"/>
-            <w:bottom w:w="0" w:type="dxa"/>
-          </w:tblCellMar>
-        </w:tblPrEx>
         <w:tc>
           <w:tcPr>
             <w:tcW w:w="2300" w:type="dxa"/>
@@ -9500,12 +8960,6 @@
         </w:tc>
       </w:tr>
       <w:tr>
-        <w:tblPrEx>
-          <w:tblCellMar>
-            <w:top w:w="0" w:type="dxa"/>
-            <w:bottom w:w="0" w:type="dxa"/>
-          </w:tblCellMar>
-        </w:tblPrEx>
         <w:tc>
           <w:tcPr>
             <w:tcW w:w="2300" w:type="dxa"/>
@@ -9565,12 +9019,6 @@
         </w:tc>
       </w:tr>
       <w:tr>
-        <w:tblPrEx>
-          <w:tblCellMar>
-            <w:top w:w="0" w:type="dxa"/>
-            <w:bottom w:w="0" w:type="dxa"/>
-          </w:tblCellMar>
-        </w:tblPrEx>
         <w:tc>
           <w:tcPr>
             <w:tcW w:w="2300" w:type="dxa"/>
@@ -9698,12 +9146,6 @@
         <w:gridCol w:w="5096"/>
       </w:tblGrid>
       <w:tr>
-        <w:tblPrEx>
-          <w:tblCellMar>
-            <w:top w:w="0" w:type="dxa"/>
-            <w:bottom w:w="0" w:type="dxa"/>
-          </w:tblCellMar>
-        </w:tblPrEx>
         <w:trPr>
           <w:tblHeader/>
         </w:trPr>
@@ -9782,12 +9224,6 @@
         </w:tc>
       </w:tr>
       <w:tr>
-        <w:tblPrEx>
-          <w:tblCellMar>
-            <w:top w:w="0" w:type="dxa"/>
-            <w:bottom w:w="0" w:type="dxa"/>
-          </w:tblCellMar>
-        </w:tblPrEx>
         <w:tc>
           <w:tcPr>
             <w:tcW w:w="2300" w:type="dxa"/>
@@ -9847,12 +9283,6 @@
         </w:tc>
       </w:tr>
       <w:tr>
-        <w:tblPrEx>
-          <w:tblCellMar>
-            <w:top w:w="0" w:type="dxa"/>
-            <w:bottom w:w="0" w:type="dxa"/>
-          </w:tblCellMar>
-        </w:tblPrEx>
         <w:tc>
           <w:tcPr>
             <w:tcW w:w="2300" w:type="dxa"/>
@@ -9912,12 +9342,6 @@
         </w:tc>
       </w:tr>
       <w:tr>
-        <w:tblPrEx>
-          <w:tblCellMar>
-            <w:top w:w="0" w:type="dxa"/>
-            <w:bottom w:w="0" w:type="dxa"/>
-          </w:tblCellMar>
-        </w:tblPrEx>
         <w:tc>
           <w:tcPr>
             <w:tcW w:w="2300" w:type="dxa"/>
@@ -9977,12 +9401,6 @@
         </w:tc>
       </w:tr>
       <w:tr>
-        <w:tblPrEx>
-          <w:tblCellMar>
-            <w:top w:w="0" w:type="dxa"/>
-            <w:bottom w:w="0" w:type="dxa"/>
-          </w:tblCellMar>
-        </w:tblPrEx>
         <w:tc>
           <w:tcPr>
             <w:tcW w:w="2300" w:type="dxa"/>
@@ -10042,12 +9460,6 @@
         </w:tc>
       </w:tr>
       <w:tr>
-        <w:tblPrEx>
-          <w:tblCellMar>
-            <w:top w:w="0" w:type="dxa"/>
-            <w:bottom w:w="0" w:type="dxa"/>
-          </w:tblCellMar>
-        </w:tblPrEx>
         <w:tc>
           <w:tcPr>
             <w:tcW w:w="2300" w:type="dxa"/>
@@ -10107,12 +9519,6 @@
         </w:tc>
       </w:tr>
       <w:tr>
-        <w:tblPrEx>
-          <w:tblCellMar>
-            <w:top w:w="0" w:type="dxa"/>
-            <w:bottom w:w="0" w:type="dxa"/>
-          </w:tblCellMar>
-        </w:tblPrEx>
         <w:tc>
           <w:tcPr>
             <w:tcW w:w="2300" w:type="dxa"/>
@@ -10172,12 +9578,6 @@
         </w:tc>
       </w:tr>
       <w:tr>
-        <w:tblPrEx>
-          <w:tblCellMar>
-            <w:top w:w="0" w:type="dxa"/>
-            <w:bottom w:w="0" w:type="dxa"/>
-          </w:tblCellMar>
-        </w:tblPrEx>
         <w:tc>
           <w:tcPr>
             <w:tcW w:w="2300" w:type="dxa"/>
@@ -10245,12 +9645,6 @@
         </w:tc>
       </w:tr>
       <w:tr>
-        <w:tblPrEx>
-          <w:tblCellMar>
-            <w:top w:w="0" w:type="dxa"/>
-            <w:bottom w:w="0" w:type="dxa"/>
-          </w:tblCellMar>
-        </w:tblPrEx>
         <w:tc>
           <w:tcPr>
             <w:tcW w:w="2300" w:type="dxa"/>
@@ -10318,12 +9712,6 @@
         </w:tc>
       </w:tr>
       <w:tr>
-        <w:tblPrEx>
-          <w:tblCellMar>
-            <w:top w:w="0" w:type="dxa"/>
-            <w:bottom w:w="0" w:type="dxa"/>
-          </w:tblCellMar>
-        </w:tblPrEx>
         <w:tc>
           <w:tcPr>
             <w:tcW w:w="2300" w:type="dxa"/>
@@ -10383,12 +9771,6 @@
         </w:tc>
       </w:tr>
       <w:tr>
-        <w:tblPrEx>
-          <w:tblCellMar>
-            <w:top w:w="0" w:type="dxa"/>
-            <w:bottom w:w="0" w:type="dxa"/>
-          </w:tblCellMar>
-        </w:tblPrEx>
         <w:tc>
           <w:tcPr>
             <w:tcW w:w="2300" w:type="dxa"/>
@@ -10448,12 +9830,6 @@
         </w:tc>
       </w:tr>
       <w:tr>
-        <w:tblPrEx>
-          <w:tblCellMar>
-            <w:top w:w="0" w:type="dxa"/>
-            <w:bottom w:w="0" w:type="dxa"/>
-          </w:tblCellMar>
-        </w:tblPrEx>
         <w:tc>
           <w:tcPr>
             <w:tcW w:w="2300" w:type="dxa"/>
@@ -10521,12 +9897,6 @@
         </w:tc>
       </w:tr>
       <w:tr>
-        <w:tblPrEx>
-          <w:tblCellMar>
-            <w:top w:w="0" w:type="dxa"/>
-            <w:bottom w:w="0" w:type="dxa"/>
-          </w:tblCellMar>
-        </w:tblPrEx>
         <w:tc>
           <w:tcPr>
             <w:tcW w:w="2300" w:type="dxa"/>
@@ -10662,12 +10032,6 @@
         <w:gridCol w:w="5096"/>
       </w:tblGrid>
       <w:tr>
-        <w:tblPrEx>
-          <w:tblCellMar>
-            <w:top w:w="0" w:type="dxa"/>
-            <w:bottom w:w="0" w:type="dxa"/>
-          </w:tblCellMar>
-        </w:tblPrEx>
         <w:trPr>
           <w:tblHeader/>
         </w:trPr>
@@ -10745,12 +10109,6 @@
         </w:tc>
       </w:tr>
       <w:tr>
-        <w:tblPrEx>
-          <w:tblCellMar>
-            <w:top w:w="0" w:type="dxa"/>
-            <w:bottom w:w="0" w:type="dxa"/>
-          </w:tblCellMar>
-        </w:tblPrEx>
         <w:tc>
           <w:tcPr>
             <w:tcW w:w="2300" w:type="dxa"/>
@@ -10810,12 +10168,6 @@
         </w:tc>
       </w:tr>
       <w:tr>
-        <w:tblPrEx>
-          <w:tblCellMar>
-            <w:top w:w="0" w:type="dxa"/>
-            <w:bottom w:w="0" w:type="dxa"/>
-          </w:tblCellMar>
-        </w:tblPrEx>
         <w:tc>
           <w:tcPr>
             <w:tcW w:w="2300" w:type="dxa"/>
@@ -10875,12 +10227,6 @@
         </w:tc>
       </w:tr>
       <w:tr>
-        <w:tblPrEx>
-          <w:tblCellMar>
-            <w:top w:w="0" w:type="dxa"/>
-            <w:bottom w:w="0" w:type="dxa"/>
-          </w:tblCellMar>
-        </w:tblPrEx>
         <w:tc>
           <w:tcPr>
             <w:tcW w:w="2300" w:type="dxa"/>
@@ -10940,12 +10286,6 @@
         </w:tc>
       </w:tr>
       <w:tr>
-        <w:tblPrEx>
-          <w:tblCellMar>
-            <w:top w:w="0" w:type="dxa"/>
-            <w:bottom w:w="0" w:type="dxa"/>
-          </w:tblCellMar>
-        </w:tblPrEx>
         <w:tc>
           <w:tcPr>
             <w:tcW w:w="2300" w:type="dxa"/>
@@ -11005,12 +10345,6 @@
         </w:tc>
       </w:tr>
       <w:tr>
-        <w:tblPrEx>
-          <w:tblCellMar>
-            <w:top w:w="0" w:type="dxa"/>
-            <w:bottom w:w="0" w:type="dxa"/>
-          </w:tblCellMar>
-        </w:tblPrEx>
         <w:tc>
           <w:tcPr>
             <w:tcW w:w="2300" w:type="dxa"/>
@@ -11070,12 +10404,6 @@
         </w:tc>
       </w:tr>
       <w:tr>
-        <w:tblPrEx>
-          <w:tblCellMar>
-            <w:top w:w="0" w:type="dxa"/>
-            <w:bottom w:w="0" w:type="dxa"/>
-          </w:tblCellMar>
-        </w:tblPrEx>
         <w:tc>
           <w:tcPr>
             <w:tcW w:w="2300" w:type="dxa"/>
@@ -11135,12 +10463,6 @@
         </w:tc>
       </w:tr>
       <w:tr>
-        <w:tblPrEx>
-          <w:tblCellMar>
-            <w:top w:w="0" w:type="dxa"/>
-            <w:bottom w:w="0" w:type="dxa"/>
-          </w:tblCellMar>
-        </w:tblPrEx>
         <w:tc>
           <w:tcPr>
             <w:tcW w:w="2300" w:type="dxa"/>
@@ -11256,12 +10578,6 @@
         <w:gridCol w:w="5096"/>
       </w:tblGrid>
       <w:tr>
-        <w:tblPrEx>
-          <w:tblCellMar>
-            <w:top w:w="0" w:type="dxa"/>
-            <w:bottom w:w="0" w:type="dxa"/>
-          </w:tblCellMar>
-        </w:tblPrEx>
         <w:trPr>
           <w:tblHeader/>
         </w:trPr>
@@ -11339,12 +10655,6 @@
         </w:tc>
       </w:tr>
       <w:tr>
-        <w:tblPrEx>
-          <w:tblCellMar>
-            <w:top w:w="0" w:type="dxa"/>
-            <w:bottom w:w="0" w:type="dxa"/>
-          </w:tblCellMar>
-        </w:tblPrEx>
         <w:tc>
           <w:tcPr>
             <w:tcW w:w="2300" w:type="dxa"/>
@@ -11404,12 +10714,6 @@
         </w:tc>
       </w:tr>
       <w:tr>
-        <w:tblPrEx>
-          <w:tblCellMar>
-            <w:top w:w="0" w:type="dxa"/>
-            <w:bottom w:w="0" w:type="dxa"/>
-          </w:tblCellMar>
-        </w:tblPrEx>
         <w:tc>
           <w:tcPr>
             <w:tcW w:w="2300" w:type="dxa"/>
@@ -11470,12 +10774,6 @@
         </w:tc>
       </w:tr>
       <w:tr>
-        <w:tblPrEx>
-          <w:tblCellMar>
-            <w:top w:w="0" w:type="dxa"/>
-            <w:bottom w:w="0" w:type="dxa"/>
-          </w:tblCellMar>
-        </w:tblPrEx>
         <w:tc>
           <w:tcPr>
             <w:tcW w:w="2300" w:type="dxa"/>
@@ -11535,12 +10833,6 @@
         </w:tc>
       </w:tr>
       <w:tr>
-        <w:tblPrEx>
-          <w:tblCellMar>
-            <w:top w:w="0" w:type="dxa"/>
-            <w:bottom w:w="0" w:type="dxa"/>
-          </w:tblCellMar>
-        </w:tblPrEx>
         <w:tc>
           <w:tcPr>
             <w:tcW w:w="2300" w:type="dxa"/>
@@ -11600,12 +10892,6 @@
         </w:tc>
       </w:tr>
       <w:tr>
-        <w:tblPrEx>
-          <w:tblCellMar>
-            <w:top w:w="0" w:type="dxa"/>
-            <w:bottom w:w="0" w:type="dxa"/>
-          </w:tblCellMar>
-        </w:tblPrEx>
         <w:tc>
           <w:tcPr>
             <w:tcW w:w="2300" w:type="dxa"/>
@@ -11665,12 +10951,6 @@
         </w:tc>
       </w:tr>
       <w:tr>
-        <w:tblPrEx>
-          <w:tblCellMar>
-            <w:top w:w="0" w:type="dxa"/>
-            <w:bottom w:w="0" w:type="dxa"/>
-          </w:tblCellMar>
-        </w:tblPrEx>
         <w:tc>
           <w:tcPr>
             <w:tcW w:w="2300" w:type="dxa"/>
@@ -11730,12 +11010,6 @@
         </w:tc>
       </w:tr>
       <w:tr>
-        <w:tblPrEx>
-          <w:tblCellMar>
-            <w:top w:w="0" w:type="dxa"/>
-            <w:bottom w:w="0" w:type="dxa"/>
-          </w:tblCellMar>
-        </w:tblPrEx>
         <w:tc>
           <w:tcPr>
             <w:tcW w:w="2300" w:type="dxa"/>
@@ -11851,12 +11125,6 @@
         <w:gridCol w:w="5096"/>
       </w:tblGrid>
       <w:tr>
-        <w:tblPrEx>
-          <w:tblCellMar>
-            <w:top w:w="0" w:type="dxa"/>
-            <w:bottom w:w="0" w:type="dxa"/>
-          </w:tblCellMar>
-        </w:tblPrEx>
         <w:trPr>
           <w:tblHeader/>
         </w:trPr>
@@ -11934,12 +11202,6 @@
         </w:tc>
       </w:tr>
       <w:tr>
-        <w:tblPrEx>
-          <w:tblCellMar>
-            <w:top w:w="0" w:type="dxa"/>
-            <w:bottom w:w="0" w:type="dxa"/>
-          </w:tblCellMar>
-        </w:tblPrEx>
         <w:tc>
           <w:tcPr>
             <w:tcW w:w="2300" w:type="dxa"/>
@@ -11999,12 +11261,6 @@
         </w:tc>
       </w:tr>
       <w:tr>
-        <w:tblPrEx>
-          <w:tblCellMar>
-            <w:top w:w="0" w:type="dxa"/>
-            <w:bottom w:w="0" w:type="dxa"/>
-          </w:tblCellMar>
-        </w:tblPrEx>
         <w:tc>
           <w:tcPr>
             <w:tcW w:w="2300" w:type="dxa"/>
@@ -12064,12 +11320,6 @@
         </w:tc>
       </w:tr>
       <w:tr>
-        <w:tblPrEx>
-          <w:tblCellMar>
-            <w:top w:w="0" w:type="dxa"/>
-            <w:bottom w:w="0" w:type="dxa"/>
-          </w:tblCellMar>
-        </w:tblPrEx>
         <w:tc>
           <w:tcPr>
             <w:tcW w:w="2300" w:type="dxa"/>
@@ -12129,12 +11379,6 @@
         </w:tc>
       </w:tr>
       <w:tr>
-        <w:tblPrEx>
-          <w:tblCellMar>
-            <w:top w:w="0" w:type="dxa"/>
-            <w:bottom w:w="0" w:type="dxa"/>
-          </w:tblCellMar>
-        </w:tblPrEx>
         <w:tc>
           <w:tcPr>
             <w:tcW w:w="2300" w:type="dxa"/>
@@ -12194,12 +11438,6 @@
         </w:tc>
       </w:tr>
       <w:tr>
-        <w:tblPrEx>
-          <w:tblCellMar>
-            <w:top w:w="0" w:type="dxa"/>
-            <w:bottom w:w="0" w:type="dxa"/>
-          </w:tblCellMar>
-        </w:tblPrEx>
         <w:tc>
           <w:tcPr>
             <w:tcW w:w="2300" w:type="dxa"/>
@@ -12259,12 +11497,6 @@
         </w:tc>
       </w:tr>
       <w:tr>
-        <w:tblPrEx>
-          <w:tblCellMar>
-            <w:top w:w="0" w:type="dxa"/>
-            <w:bottom w:w="0" w:type="dxa"/>
-          </w:tblCellMar>
-        </w:tblPrEx>
         <w:tc>
           <w:tcPr>
             <w:tcW w:w="2300" w:type="dxa"/>
@@ -12324,12 +11556,6 @@
         </w:tc>
       </w:tr>
       <w:tr>
-        <w:tblPrEx>
-          <w:tblCellMar>
-            <w:top w:w="0" w:type="dxa"/>
-            <w:bottom w:w="0" w:type="dxa"/>
-          </w:tblCellMar>
-        </w:tblPrEx>
         <w:tc>
           <w:tcPr>
             <w:tcW w:w="2300" w:type="dxa"/>
@@ -12389,12 +11615,6 @@
         </w:tc>
       </w:tr>
       <w:tr>
-        <w:tblPrEx>
-          <w:tblCellMar>
-            <w:top w:w="0" w:type="dxa"/>
-            <w:bottom w:w="0" w:type="dxa"/>
-          </w:tblCellMar>
-        </w:tblPrEx>
         <w:tc>
           <w:tcPr>
             <w:tcW w:w="2300" w:type="dxa"/>
@@ -12522,12 +11742,6 @@
         <w:gridCol w:w="5003"/>
       </w:tblGrid>
       <w:tr>
-        <w:tblPrEx>
-          <w:tblCellMar>
-            <w:top w:w="0" w:type="dxa"/>
-            <w:bottom w:w="0" w:type="dxa"/>
-          </w:tblCellMar>
-        </w:tblPrEx>
         <w:trPr>
           <w:tblHeader/>
         </w:trPr>
@@ -12605,12 +11819,6 @@
         </w:tc>
       </w:tr>
       <w:tr>
-        <w:tblPrEx>
-          <w:tblCellMar>
-            <w:top w:w="0" w:type="dxa"/>
-            <w:bottom w:w="0" w:type="dxa"/>
-          </w:tblCellMar>
-        </w:tblPrEx>
         <w:tc>
           <w:tcPr>
             <w:tcW w:w="2300" w:type="dxa"/>
@@ -12670,12 +11878,6 @@
         </w:tc>
       </w:tr>
       <w:tr>
-        <w:tblPrEx>
-          <w:tblCellMar>
-            <w:top w:w="0" w:type="dxa"/>
-            <w:bottom w:w="0" w:type="dxa"/>
-          </w:tblCellMar>
-        </w:tblPrEx>
         <w:tc>
           <w:tcPr>
             <w:tcW w:w="2300" w:type="dxa"/>
@@ -12735,12 +11937,6 @@
         </w:tc>
       </w:tr>
       <w:tr>
-        <w:tblPrEx>
-          <w:tblCellMar>
-            <w:top w:w="0" w:type="dxa"/>
-            <w:bottom w:w="0" w:type="dxa"/>
-          </w:tblCellMar>
-        </w:tblPrEx>
         <w:tc>
           <w:tcPr>
             <w:tcW w:w="2300" w:type="dxa"/>
@@ -12808,12 +12004,6 @@
         </w:tc>
       </w:tr>
       <w:tr>
-        <w:tblPrEx>
-          <w:tblCellMar>
-            <w:top w:w="0" w:type="dxa"/>
-            <w:bottom w:w="0" w:type="dxa"/>
-          </w:tblCellMar>
-        </w:tblPrEx>
         <w:tc>
           <w:tcPr>
             <w:tcW w:w="2300" w:type="dxa"/>
@@ -12873,12 +12063,6 @@
         </w:tc>
       </w:tr>
       <w:tr>
-        <w:tblPrEx>
-          <w:tblCellMar>
-            <w:top w:w="0" w:type="dxa"/>
-            <w:bottom w:w="0" w:type="dxa"/>
-          </w:tblCellMar>
-        </w:tblPrEx>
         <w:tc>
           <w:tcPr>
             <w:tcW w:w="2300" w:type="dxa"/>
@@ -12938,12 +12122,6 @@
         </w:tc>
       </w:tr>
       <w:tr>
-        <w:tblPrEx>
-          <w:tblCellMar>
-            <w:top w:w="0" w:type="dxa"/>
-            <w:bottom w:w="0" w:type="dxa"/>
-          </w:tblCellMar>
-        </w:tblPrEx>
         <w:tc>
           <w:tcPr>
             <w:tcW w:w="2300" w:type="dxa"/>
@@ -13011,12 +12189,6 @@
         </w:tc>
       </w:tr>
       <w:tr>
-        <w:tblPrEx>
-          <w:tblCellMar>
-            <w:top w:w="0" w:type="dxa"/>
-            <w:bottom w:w="0" w:type="dxa"/>
-          </w:tblCellMar>
-        </w:tblPrEx>
         <w:tc>
           <w:tcPr>
             <w:tcW w:w="2300" w:type="dxa"/>
@@ -13076,12 +12248,6 @@
         </w:tc>
       </w:tr>
       <w:tr>
-        <w:tblPrEx>
-          <w:tblCellMar>
-            <w:top w:w="0" w:type="dxa"/>
-            <w:bottom w:w="0" w:type="dxa"/>
-          </w:tblCellMar>
-        </w:tblPrEx>
         <w:tc>
           <w:tcPr>
             <w:tcW w:w="2300" w:type="dxa"/>
@@ -13141,12 +12307,6 @@
         </w:tc>
       </w:tr>
       <w:tr>
-        <w:tblPrEx>
-          <w:tblCellMar>
-            <w:top w:w="0" w:type="dxa"/>
-            <w:bottom w:w="0" w:type="dxa"/>
-          </w:tblCellMar>
-        </w:tblPrEx>
         <w:tc>
           <w:tcPr>
             <w:tcW w:w="2300" w:type="dxa"/>
@@ -13215,12 +12375,6 @@
         </w:tc>
       </w:tr>
       <w:tr>
-        <w:tblPrEx>
-          <w:tblCellMar>
-            <w:top w:w="0" w:type="dxa"/>
-            <w:bottom w:w="0" w:type="dxa"/>
-          </w:tblCellMar>
-        </w:tblPrEx>
         <w:tc>
           <w:tcPr>
             <w:tcW w:w="2300" w:type="dxa"/>
@@ -13288,12 +12442,6 @@
         </w:tc>
       </w:tr>
       <w:tr>
-        <w:tblPrEx>
-          <w:tblCellMar>
-            <w:top w:w="0" w:type="dxa"/>
-            <w:bottom w:w="0" w:type="dxa"/>
-          </w:tblCellMar>
-        </w:tblPrEx>
         <w:tc>
           <w:tcPr>
             <w:tcW w:w="2300" w:type="dxa"/>
@@ -13409,12 +12557,6 @@
         <w:gridCol w:w="5096"/>
       </w:tblGrid>
       <w:tr>
-        <w:tblPrEx>
-          <w:tblCellMar>
-            <w:top w:w="0" w:type="dxa"/>
-            <w:bottom w:w="0" w:type="dxa"/>
-          </w:tblCellMar>
-        </w:tblPrEx>
         <w:trPr>
           <w:tblHeader/>
         </w:trPr>
@@ -13492,12 +12634,6 @@
         </w:tc>
       </w:tr>
       <w:tr>
-        <w:tblPrEx>
-          <w:tblCellMar>
-            <w:top w:w="0" w:type="dxa"/>
-            <w:bottom w:w="0" w:type="dxa"/>
-          </w:tblCellMar>
-        </w:tblPrEx>
         <w:tc>
           <w:tcPr>
             <w:tcW w:w="2300" w:type="dxa"/>
@@ -13557,12 +12693,6 @@
         </w:tc>
       </w:tr>
       <w:tr>
-        <w:tblPrEx>
-          <w:tblCellMar>
-            <w:top w:w="0" w:type="dxa"/>
-            <w:bottom w:w="0" w:type="dxa"/>
-          </w:tblCellMar>
-        </w:tblPrEx>
         <w:tc>
           <w:tcPr>
             <w:tcW w:w="2300" w:type="dxa"/>
@@ -13630,12 +12760,6 @@
         </w:tc>
       </w:tr>
       <w:tr>
-        <w:tblPrEx>
-          <w:tblCellMar>
-            <w:top w:w="0" w:type="dxa"/>
-            <w:bottom w:w="0" w:type="dxa"/>
-          </w:tblCellMar>
-        </w:tblPrEx>
         <w:tc>
           <w:tcPr>
             <w:tcW w:w="2300" w:type="dxa"/>
@@ -13695,12 +12819,6 @@
         </w:tc>
       </w:tr>
       <w:tr>
-        <w:tblPrEx>
-          <w:tblCellMar>
-            <w:top w:w="0" w:type="dxa"/>
-            <w:bottom w:w="0" w:type="dxa"/>
-          </w:tblCellMar>
-        </w:tblPrEx>
         <w:tc>
           <w:tcPr>
             <w:tcW w:w="2300" w:type="dxa"/>
@@ -13760,12 +12878,6 @@
         </w:tc>
       </w:tr>
       <w:tr>
-        <w:tblPrEx>
-          <w:tblCellMar>
-            <w:top w:w="0" w:type="dxa"/>
-            <w:bottom w:w="0" w:type="dxa"/>
-          </w:tblCellMar>
-        </w:tblPrEx>
         <w:tc>
           <w:tcPr>
             <w:tcW w:w="2300" w:type="dxa"/>
@@ -13881,12 +12993,6 @@
         <w:gridCol w:w="5096"/>
       </w:tblGrid>
       <w:tr>
-        <w:tblPrEx>
-          <w:tblCellMar>
-            <w:top w:w="0" w:type="dxa"/>
-            <w:bottom w:w="0" w:type="dxa"/>
-          </w:tblCellMar>
-        </w:tblPrEx>
         <w:trPr>
           <w:tblHeader/>
         </w:trPr>
@@ -13964,12 +13070,6 @@
         </w:tc>
       </w:tr>
       <w:tr>
-        <w:tblPrEx>
-          <w:tblCellMar>
-            <w:top w:w="0" w:type="dxa"/>
-            <w:bottom w:w="0" w:type="dxa"/>
-          </w:tblCellMar>
-        </w:tblPrEx>
         <w:tc>
           <w:tcPr>
             <w:tcW w:w="2300" w:type="dxa"/>
@@ -14029,12 +13129,6 @@
         </w:tc>
       </w:tr>
       <w:tr>
-        <w:tblPrEx>
-          <w:tblCellMar>
-            <w:top w:w="0" w:type="dxa"/>
-            <w:bottom w:w="0" w:type="dxa"/>
-          </w:tblCellMar>
-        </w:tblPrEx>
         <w:tc>
           <w:tcPr>
             <w:tcW w:w="2300" w:type="dxa"/>
@@ -14094,12 +13188,6 @@
         </w:tc>
       </w:tr>
       <w:tr>
-        <w:tblPrEx>
-          <w:tblCellMar>
-            <w:top w:w="0" w:type="dxa"/>
-            <w:bottom w:w="0" w:type="dxa"/>
-          </w:tblCellMar>
-        </w:tblPrEx>
         <w:tc>
           <w:tcPr>
             <w:tcW w:w="2300" w:type="dxa"/>
@@ -14167,12 +13255,6 @@
         </w:tc>
       </w:tr>
       <w:tr>
-        <w:tblPrEx>
-          <w:tblCellMar>
-            <w:top w:w="0" w:type="dxa"/>
-            <w:bottom w:w="0" w:type="dxa"/>
-          </w:tblCellMar>
-        </w:tblPrEx>
         <w:tc>
           <w:tcPr>
             <w:tcW w:w="2300" w:type="dxa"/>
@@ -14232,12 +13314,6 @@
         </w:tc>
       </w:tr>
       <w:tr>
-        <w:tblPrEx>
-          <w:tblCellMar>
-            <w:top w:w="0" w:type="dxa"/>
-            <w:bottom w:w="0" w:type="dxa"/>
-          </w:tblCellMar>
-        </w:tblPrEx>
         <w:tc>
           <w:tcPr>
             <w:tcW w:w="2300" w:type="dxa"/>
@@ -14377,12 +13453,6 @@
         <w:gridCol w:w="2646"/>
       </w:tblGrid>
       <w:tr>
-        <w:tblPrEx>
-          <w:tblCellMar>
-            <w:top w:w="0" w:type="dxa"/>
-            <w:bottom w:w="0" w:type="dxa"/>
-          </w:tblCellMar>
-        </w:tblPrEx>
         <w:trPr>
           <w:tblHeader/>
         </w:trPr>
@@ -14484,12 +13554,6 @@
         </w:tc>
       </w:tr>
       <w:tr>
-        <w:tblPrEx>
-          <w:tblCellMar>
-            <w:top w:w="0" w:type="dxa"/>
-            <w:bottom w:w="0" w:type="dxa"/>
-          </w:tblCellMar>
-        </w:tblPrEx>
         <w:tc>
           <w:tcPr>
             <w:tcW w:w="2500" w:type="dxa"/>
@@ -14578,12 +13642,6 @@
         </w:tc>
       </w:tr>
       <w:tr>
-        <w:tblPrEx>
-          <w:tblCellMar>
-            <w:top w:w="0" w:type="dxa"/>
-            <w:bottom w:w="0" w:type="dxa"/>
-          </w:tblCellMar>
-        </w:tblPrEx>
         <w:tc>
           <w:tcPr>
             <w:tcW w:w="2500" w:type="dxa"/>
@@ -14673,12 +13731,6 @@
         </w:tc>
       </w:tr>
       <w:tr>
-        <w:tblPrEx>
-          <w:tblCellMar>
-            <w:top w:w="0" w:type="dxa"/>
-            <w:bottom w:w="0" w:type="dxa"/>
-          </w:tblCellMar>
-        </w:tblPrEx>
         <w:tc>
           <w:tcPr>
             <w:tcW w:w="2500" w:type="dxa"/>
@@ -14767,12 +13819,6 @@
         </w:tc>
       </w:tr>
       <w:tr>
-        <w:tblPrEx>
-          <w:tblCellMar>
-            <w:top w:w="0" w:type="dxa"/>
-            <w:bottom w:w="0" w:type="dxa"/>
-          </w:tblCellMar>
-        </w:tblPrEx>
         <w:tc>
           <w:tcPr>
             <w:tcW w:w="2500" w:type="dxa"/>
@@ -14861,12 +13907,6 @@
         </w:tc>
       </w:tr>
       <w:tr>
-        <w:tblPrEx>
-          <w:tblCellMar>
-            <w:top w:w="0" w:type="dxa"/>
-            <w:bottom w:w="0" w:type="dxa"/>
-          </w:tblCellMar>
-        </w:tblPrEx>
         <w:tc>
           <w:tcPr>
             <w:tcW w:w="2500" w:type="dxa"/>
@@ -14955,12 +13995,6 @@
         </w:tc>
       </w:tr>
       <w:tr>
-        <w:tblPrEx>
-          <w:tblCellMar>
-            <w:top w:w="0" w:type="dxa"/>
-            <w:bottom w:w="0" w:type="dxa"/>
-          </w:tblCellMar>
-        </w:tblPrEx>
         <w:tc>
           <w:tcPr>
             <w:tcW w:w="2500" w:type="dxa"/>
@@ -15049,12 +14083,6 @@
         </w:tc>
       </w:tr>
       <w:tr>
-        <w:tblPrEx>
-          <w:tblCellMar>
-            <w:top w:w="0" w:type="dxa"/>
-            <w:bottom w:w="0" w:type="dxa"/>
-          </w:tblCellMar>
-        </w:tblPrEx>
         <w:tc>
           <w:tcPr>
             <w:tcW w:w="2500" w:type="dxa"/>
@@ -15187,12 +14215,6 @@
         <w:gridCol w:w="2622"/>
       </w:tblGrid>
       <w:tr>
-        <w:tblPrEx>
-          <w:tblCellMar>
-            <w:top w:w="0" w:type="dxa"/>
-            <w:bottom w:w="0" w:type="dxa"/>
-          </w:tblCellMar>
-        </w:tblPrEx>
         <w:trPr>
           <w:tblHeader/>
         </w:trPr>
@@ -15294,12 +14316,6 @@
         </w:tc>
       </w:tr>
       <w:tr>
-        <w:tblPrEx>
-          <w:tblCellMar>
-            <w:top w:w="0" w:type="dxa"/>
-            <w:bottom w:w="0" w:type="dxa"/>
-          </w:tblCellMar>
-        </w:tblPrEx>
         <w:tc>
           <w:tcPr>
             <w:tcW w:w="2500" w:type="dxa"/>
@@ -15388,12 +14404,6 @@
         </w:tc>
       </w:tr>
       <w:tr>
-        <w:tblPrEx>
-          <w:tblCellMar>
-            <w:top w:w="0" w:type="dxa"/>
-            <w:bottom w:w="0" w:type="dxa"/>
-          </w:tblCellMar>
-        </w:tblPrEx>
         <w:tc>
           <w:tcPr>
             <w:tcW w:w="2500" w:type="dxa"/>
@@ -15482,12 +14492,6 @@
         </w:tc>
       </w:tr>
       <w:tr>
-        <w:tblPrEx>
-          <w:tblCellMar>
-            <w:top w:w="0" w:type="dxa"/>
-            <w:bottom w:w="0" w:type="dxa"/>
-          </w:tblCellMar>
-        </w:tblPrEx>
         <w:tc>
           <w:tcPr>
             <w:tcW w:w="2500" w:type="dxa"/>
@@ -15576,12 +14580,6 @@
         </w:tc>
       </w:tr>
       <w:tr>
-        <w:tblPrEx>
-          <w:tblCellMar>
-            <w:top w:w="0" w:type="dxa"/>
-            <w:bottom w:w="0" w:type="dxa"/>
-          </w:tblCellMar>
-        </w:tblPrEx>
         <w:tc>
           <w:tcPr>
             <w:tcW w:w="2500" w:type="dxa"/>
@@ -15670,12 +14668,6 @@
         </w:tc>
       </w:tr>
       <w:tr>
-        <w:tblPrEx>
-          <w:tblCellMar>
-            <w:top w:w="0" w:type="dxa"/>
-            <w:bottom w:w="0" w:type="dxa"/>
-          </w:tblCellMar>
-        </w:tblPrEx>
         <w:tc>
           <w:tcPr>
             <w:tcW w:w="2500" w:type="dxa"/>
@@ -15764,12 +14756,6 @@
         </w:tc>
       </w:tr>
       <w:tr>
-        <w:tblPrEx>
-          <w:tblCellMar>
-            <w:top w:w="0" w:type="dxa"/>
-            <w:bottom w:w="0" w:type="dxa"/>
-          </w:tblCellMar>
-        </w:tblPrEx>
         <w:tc>
           <w:tcPr>
             <w:tcW w:w="2500" w:type="dxa"/>
@@ -15858,12 +14844,6 @@
         </w:tc>
       </w:tr>
       <w:tr>
-        <w:tblPrEx>
-          <w:tblCellMar>
-            <w:top w:w="0" w:type="dxa"/>
-            <w:bottom w:w="0" w:type="dxa"/>
-          </w:tblCellMar>
-        </w:tblPrEx>
         <w:tc>
           <w:tcPr>
             <w:tcW w:w="2500" w:type="dxa"/>
@@ -16005,12 +14985,6 @@
         <w:gridCol w:w="2738"/>
       </w:tblGrid>
       <w:tr>
-        <w:tblPrEx>
-          <w:tblCellMar>
-            <w:top w:w="0" w:type="dxa"/>
-            <w:bottom w:w="0" w:type="dxa"/>
-          </w:tblCellMar>
-        </w:tblPrEx>
         <w:trPr>
           <w:tblHeader/>
         </w:trPr>
@@ -16112,12 +15086,6 @@
         </w:tc>
       </w:tr>
       <w:tr>
-        <w:tblPrEx>
-          <w:tblCellMar>
-            <w:top w:w="0" w:type="dxa"/>
-            <w:bottom w:w="0" w:type="dxa"/>
-          </w:tblCellMar>
-        </w:tblPrEx>
         <w:tc>
           <w:tcPr>
             <w:tcW w:w="2500" w:type="dxa"/>
@@ -16206,12 +15174,6 @@
         </w:tc>
       </w:tr>
       <w:tr>
-        <w:tblPrEx>
-          <w:tblCellMar>
-            <w:top w:w="0" w:type="dxa"/>
-            <w:bottom w:w="0" w:type="dxa"/>
-          </w:tblCellMar>
-        </w:tblPrEx>
         <w:tc>
           <w:tcPr>
             <w:tcW w:w="2500" w:type="dxa"/>
@@ -16300,12 +15262,6 @@
         </w:tc>
       </w:tr>
       <w:tr>
-        <w:tblPrEx>
-          <w:tblCellMar>
-            <w:top w:w="0" w:type="dxa"/>
-            <w:bottom w:w="0" w:type="dxa"/>
-          </w:tblCellMar>
-        </w:tblPrEx>
         <w:tc>
           <w:tcPr>
             <w:tcW w:w="2500" w:type="dxa"/>
@@ -16394,12 +15350,6 @@
         </w:tc>
       </w:tr>
       <w:tr>
-        <w:tblPrEx>
-          <w:tblCellMar>
-            <w:top w:w="0" w:type="dxa"/>
-            <w:bottom w:w="0" w:type="dxa"/>
-          </w:tblCellMar>
-        </w:tblPrEx>
         <w:tc>
           <w:tcPr>
             <w:tcW w:w="2500" w:type="dxa"/>
@@ -16488,12 +15438,6 @@
         </w:tc>
       </w:tr>
       <w:tr>
-        <w:tblPrEx>
-          <w:tblCellMar>
-            <w:top w:w="0" w:type="dxa"/>
-            <w:bottom w:w="0" w:type="dxa"/>
-          </w:tblCellMar>
-        </w:tblPrEx>
         <w:tc>
           <w:tcPr>
             <w:tcW w:w="2500" w:type="dxa"/>
@@ -16582,12 +15526,6 @@
         </w:tc>
       </w:tr>
       <w:tr>
-        <w:tblPrEx>
-          <w:tblCellMar>
-            <w:top w:w="0" w:type="dxa"/>
-            <w:bottom w:w="0" w:type="dxa"/>
-          </w:tblCellMar>
-        </w:tblPrEx>
         <w:tc>
           <w:tcPr>
             <w:tcW w:w="2500" w:type="dxa"/>
@@ -16676,12 +15614,6 @@
         </w:tc>
       </w:tr>
       <w:tr>
-        <w:tblPrEx>
-          <w:tblCellMar>
-            <w:top w:w="0" w:type="dxa"/>
-            <w:bottom w:w="0" w:type="dxa"/>
-          </w:tblCellMar>
-        </w:tblPrEx>
         <w:tc>
           <w:tcPr>
             <w:tcW w:w="2500" w:type="dxa"/>
@@ -16770,12 +15702,6 @@
         </w:tc>
       </w:tr>
       <w:tr>
-        <w:tblPrEx>
-          <w:tblCellMar>
-            <w:top w:w="0" w:type="dxa"/>
-            <w:bottom w:w="0" w:type="dxa"/>
-          </w:tblCellMar>
-        </w:tblPrEx>
         <w:tc>
           <w:tcPr>
             <w:tcW w:w="2500" w:type="dxa"/>
@@ -16864,12 +15790,6 @@
         </w:tc>
       </w:tr>
       <w:tr>
-        <w:tblPrEx>
-          <w:tblCellMar>
-            <w:top w:w="0" w:type="dxa"/>
-            <w:bottom w:w="0" w:type="dxa"/>
-          </w:tblCellMar>
-        </w:tblPrEx>
         <w:tc>
           <w:tcPr>
             <w:tcW w:w="2500" w:type="dxa"/>
@@ -16958,12 +15878,6 @@
         </w:tc>
       </w:tr>
       <w:tr>
-        <w:tblPrEx>
-          <w:tblCellMar>
-            <w:top w:w="0" w:type="dxa"/>
-            <w:bottom w:w="0" w:type="dxa"/>
-          </w:tblCellMar>
-        </w:tblPrEx>
         <w:tc>
           <w:tcPr>
             <w:tcW w:w="2500" w:type="dxa"/>
@@ -17052,12 +15966,6 @@
         </w:tc>
       </w:tr>
       <w:tr>
-        <w:tblPrEx>
-          <w:tblCellMar>
-            <w:top w:w="0" w:type="dxa"/>
-            <w:bottom w:w="0" w:type="dxa"/>
-          </w:tblCellMar>
-        </w:tblPrEx>
         <w:tc>
           <w:tcPr>
             <w:tcW w:w="2500" w:type="dxa"/>
@@ -17146,12 +16054,6 @@
         </w:tc>
       </w:tr>
       <w:tr>
-        <w:tblPrEx>
-          <w:tblCellMar>
-            <w:top w:w="0" w:type="dxa"/>
-            <w:bottom w:w="0" w:type="dxa"/>
-          </w:tblCellMar>
-        </w:tblPrEx>
         <w:tc>
           <w:tcPr>
             <w:tcW w:w="2500" w:type="dxa"/>
@@ -17284,12 +16186,6 @@
         <w:gridCol w:w="2796"/>
       </w:tblGrid>
       <w:tr>
-        <w:tblPrEx>
-          <w:tblCellMar>
-            <w:top w:w="0" w:type="dxa"/>
-            <w:bottom w:w="0" w:type="dxa"/>
-          </w:tblCellMar>
-        </w:tblPrEx>
         <w:trPr>
           <w:tblHeader/>
         </w:trPr>
@@ -17392,12 +16288,6 @@
         </w:tc>
       </w:tr>
       <w:tr>
-        <w:tblPrEx>
-          <w:tblCellMar>
-            <w:top w:w="0" w:type="dxa"/>
-            <w:bottom w:w="0" w:type="dxa"/>
-          </w:tblCellMar>
-        </w:tblPrEx>
         <w:tc>
           <w:tcPr>
             <w:tcW w:w="2500" w:type="dxa"/>
@@ -17486,12 +16376,6 @@
         </w:tc>
       </w:tr>
       <w:tr>
-        <w:tblPrEx>
-          <w:tblCellMar>
-            <w:top w:w="0" w:type="dxa"/>
-            <w:bottom w:w="0" w:type="dxa"/>
-          </w:tblCellMar>
-        </w:tblPrEx>
         <w:tc>
           <w:tcPr>
             <w:tcW w:w="2500" w:type="dxa"/>
@@ -17580,12 +16464,6 @@
         </w:tc>
       </w:tr>
       <w:tr>
-        <w:tblPrEx>
-          <w:tblCellMar>
-            <w:top w:w="0" w:type="dxa"/>
-            <w:bottom w:w="0" w:type="dxa"/>
-          </w:tblCellMar>
-        </w:tblPrEx>
         <w:tc>
           <w:tcPr>
             <w:tcW w:w="2500" w:type="dxa"/>
@@ -17674,12 +16552,6 @@
         </w:tc>
       </w:tr>
       <w:tr>
-        <w:tblPrEx>
-          <w:tblCellMar>
-            <w:top w:w="0" w:type="dxa"/>
-            <w:bottom w:w="0" w:type="dxa"/>
-          </w:tblCellMar>
-        </w:tblPrEx>
         <w:tc>
           <w:tcPr>
             <w:tcW w:w="2500" w:type="dxa"/>
@@ -17768,12 +16640,6 @@
         </w:tc>
       </w:tr>
       <w:tr>
-        <w:tblPrEx>
-          <w:tblCellMar>
-            <w:top w:w="0" w:type="dxa"/>
-            <w:bottom w:w="0" w:type="dxa"/>
-          </w:tblCellMar>
-        </w:tblPrEx>
         <w:tc>
           <w:tcPr>
             <w:tcW w:w="2500" w:type="dxa"/>
@@ -18589,7 +17455,7 @@
           <w:sz w:val="22"/>
           <w:szCs w:val="22"/>
         </w:rPr>
-        <w:t>По часовник</w:t>
+        <w:t>По време</w:t>
       </w:r>
     </w:p>
     <w:p>
@@ -18602,7 +17468,7 @@
         <w:spacing w:after="90" w:line="290" w:lineRule="auto"/>
       </w:pPr>
       <w:r>
-        <w:t>Предварителната проверка при запис на schedule хваща само self-conflict вътре в САМАТА зона — не може да предвиди, че точно в тоя интервал друга зона (ръчна или също по часовник) държи слота зает.</w:t>
+        <w:t>Предварителната проверка при запис на schedule хваща само self-conflict вътре в САМАТА зона — не може да предвиди, че точно в тоя интервал друга зона (ръчна или също по време) държи слота зает.</w:t>
       </w:r>
     </w:p>
     <w:p>
@@ -18676,7 +17542,7 @@
           <w:sz w:val="19"/>
           <w:szCs w:val="19"/>
         </w:rPr>
-        <w:t>Разликата между „по часовник“ и „по прагове“ не е „единият чака, другият не“ — и двата чакат/повтарят опит на всеки цикъл, докато условието им е валидно (интервал за единия, сигнал от сензор за другия); разликата е само защо искат да са включени. Само РЪЧНИЯТ режим е мигновен твърд отказ без чакане — pop-up с бутон „ОК“ директно в dashboard-а, без ред в ZONE_ERRORS.</w:t>
+        <w:t>Разликата между „по време“ и „по прагове“ не е „единият чака, другият не“ — и двата чакат/повтарят опит на всеки цикъл, докато условието им е валидно (интервал за единия, сигнал от сензор за другия); разликата е само защо искат да са включени. Само РЪЧНИЯТ режим е мигновен твърд отказ без чакане — pop-up с бутон „ОК“ директно в dashboard-а, без ред в ZONE_ERRORS.</w:t>
       </w:r>
     </w:p>
     <w:p>
@@ -18800,7 +17666,7 @@
         <w:t xml:space="preserve">Агроном — </w:t>
       </w:r>
       <w:r>
-        <w:t>управлява агрономските параметри: режим на работа на зоната (ръчен/по часовник/по прагови стойности), настройки на всеки режим, и ръчно управление на клапани — само за зоните, за които има control права.</w:t>
+        <w:t>управлява агрономските параметри: режим на работа на зоната (ръчен/по време/по прагови стойности), настройки на всеки режим, и ръчно управление на клапани — само за зоните, за които има control права.</w:t>
       </w:r>
     </w:p>
     <w:p>
@@ -18833,8 +17699,11 @@
         <w:spacing w:after="90" w:line="290" w:lineRule="auto"/>
       </w:pPr>
       <w:r>
+        <w:t xml:space="preserve">Достъпът до конкретни зони (и нивото на права — преглед или управление) се определя индивидуално от администратора за всеки потребител. В рамките на разрешените му зони, всеки </w:t>
+      </w:r>
+      <w:r>
         <w:lastRenderedPageBreak/>
-        <w:t>Достъпът до конкретни зони (и нивото на права — преглед или управление) се определя индивидуално от администратора за всеки потребител. В рамките на разрешените му зони, всеки потребител сам избира кои да са закачени на началния му екран — лична преференция, специфична за устройството, не се налага от администратора.</w:t>
+        <w:t>потребител сам избира кои да са закачени на началния му екран — лична преференция, специфична за устройството, не се налага от администратора.</w:t>
       </w:r>
     </w:p>
     <w:p>
@@ -19027,7 +17896,7 @@
         <w:t xml:space="preserve">(3) Управление — </w:t>
       </w:r>
       <w:r>
-        <w:t>избор на режим + бутон „Настройки на управлението“, плюс плочки за всеки клапан/помпа в зоната с текущо състояние и бутони вкл./изкл.; при режим „по часовник“ всеки клапан показва кога следващо ще се включи/изключи според schedule-а; при „по прагове“ ръчното управление е напълно забранено (сивее).</w:t>
+        <w:t>избор на режим + бутон „Настройки на управлението“, плюс плочки за всеки клапан/помпа в зоната с текущо състояние и бутони вкл./изкл.; при режим „по време“ всеки клапан показва кога следващо ще се включи/изключи според schedule-а; при „по прагове“ ръчното управление е напълно забранено (сивее).</w:t>
       </w:r>
     </w:p>
     <w:p>
@@ -19109,11 +17978,7 @@
         <w:spacing w:after="90" w:line="290" w:lineRule="auto"/>
       </w:pPr>
       <w:r>
-        <w:t xml:space="preserve">Реализирано като MySQL Event (вграден планировчик в самата база), който всяка нощ в зададен час автоматично изтрива редове от sensor_readings, по-стари от зададен период (напр. 90 дни), и ако има </w:t>
-      </w:r>
-      <w:r>
-        <w:lastRenderedPageBreak/>
-        <w:t>други ненужни данни. Не изисква отделен Python процес — работи директно в базата, независимо от състоянието на другите скриптове.</w:t>
+        <w:t>Реализирано като MySQL Event (вграден планировчик в самата база), който всяка нощ в зададен час автоматично изтрива редове от sensor_readings, по-стари от зададен период (напр. 90 дни), и ако има други ненужни данни. Не изисква отделен Python процес — работи директно в базата, независимо от състоянието на другите скриптове.</w:t>
       </w:r>
     </w:p>
     <w:p>
@@ -19133,6 +17998,7 @@
           <w:sz w:val="25"/>
           <w:szCs w:val="25"/>
         </w:rPr>
+        <w:lastRenderedPageBreak/>
         <w:t>Backup на базата на отдалечен сървър</w:t>
       </w:r>
     </w:p>
@@ -19360,7 +18226,6 @@
         <w:spacing w:after="90" w:line="290" w:lineRule="auto"/>
       </w:pPr>
       <w:r>
-        <w:lastRenderedPageBreak/>
         <w:t>nginx контейнерът ползва nginxinc/nginx-unprivileged (слуша на порт 8080 вътрешно, docker-compose.yml мапва host порт 80 към него — прозрачно за браузъра) вместо стандартния nginx:alpine, който изисква root права за порт 80.</w:t>
       </w:r>
     </w:p>
@@ -19394,6 +18259,7 @@
           <w:sz w:val="25"/>
           <w:szCs w:val="25"/>
         </w:rPr>
+        <w:lastRenderedPageBreak/>
         <w:t>Споделена конфигурация между контейнерите</w:t>
       </w:r>
     </w:p>
@@ -19512,7 +18378,7 @@
         <w:spacing w:after="90" w:line="290" w:lineRule="auto"/>
       </w:pPr>
       <w:r>
-        <w:t>Часовите интервали в режим „по часовник“ (start_time/end_time) се сравняват спрямо локалния час на самото устройство, не спрямо UTC — docker-compose.yml монтира /etc/localtime от хоста (read-only) във всеки backend контейнер, така че системата автоматично следва каквато часова зона е конфигурирана на Pi-то, без ръчна настройка за всеки обект.</w:t>
+        <w:t>Часовите интервали в режим „по време“ (start_time/end_time) се сравняват спрямо локалния час на самото устройство, не спрямо UTC — docker-compose.yml монтира /etc/localtime от хоста (read-only) във всеки backend контейнер, така че системата автоматично следва каквато часова зона е конфигурирана на Pi-то, без ръчна настройка за всеки обект.</w:t>
       </w:r>
     </w:p>
     <w:p>
@@ -19578,7 +18444,7 @@
         <w:spacing w:after="90" w:line="290" w:lineRule="auto"/>
       </w:pPr>
       <w:r>
-        <w:t>Backup на базата данни (описан по-горе като systemd timer + mysqldump концепция) и HTTPS/TLS на dashboard-а и MQTT връзката ще се проектират конкретно при реалната инсталация на обекта, съобразени с наличната мрежова свързаност там (публичен domain или чист LAN).</w:t>
+        <w:t>Backup на базата данни (описан по-горе като systemd timer + mysqldump концепция), HTTPS/TLS на dashboard-а и MQTT връзката, както и нотификациите към потребителите (известия при възникнал проблем) ще се проектират конкретно при реалната инсталация на обекта, съобразени с наличната мрежова свързаност там (публичен domain или чист LAN).</w:t>
       </w:r>
     </w:p>
     <w:p>
@@ -19591,7 +18457,6 @@
         <w:spacing w:after="90" w:line="290" w:lineRule="auto"/>
       </w:pPr>
       <w:r>
-        <w:lastRenderedPageBreak/>
         <w:t>Docker images за Raspberry Pi (ARM64) могат да се изградят и на Windows машина с Docker Desktop (WSL2 backend) — единствената особеност е изричен --platform linux/arm64 при build, тъй като хост архитектурата обикновено е x86_64.</w:t>
       </w:r>
     </w:p>
@@ -19605,6 +18470,7 @@
         <w:spacing w:after="90" w:line="290" w:lineRule="auto"/>
       </w:pPr>
       <w:r>
+        <w:lastRenderedPageBreak/>
         <w:t>Secure флагът на cookie-то на сесията се включва заедно с HTTPS при реалния деплой — по подразбиране е изключен само защото локалната демо среда е чист http, а браузърът мълчаливо отказва Secure cookie на http.</w:t>
       </w:r>
     </w:p>

</xml_diff>